<commit_message>
Update Phase 1 design document
</commit_message>
<xml_diff>
--- a/documentation/TaskDesk_Phase1_Design_Document.docx
+++ b/documentation/TaskDesk_Phase1_Design_Document.docx
@@ -7,7 +7,6 @@
         <w:spacing w:before="240" w:after="100"/>
         <w:jc w:val="center"/>
       </w:pPr>
-      <w:proofErr w:type="spellStart"/>
       <w:r>
         <w:rPr>
           <w:b/>
@@ -16,18 +15,7 @@
           <w:sz w:val="56"/>
           <w:szCs w:val="56"/>
         </w:rPr>
-        <w:t>TaskDesk</w:t>
-      </w:r>
-      <w:proofErr w:type="spellEnd"/>
-      <w:r>
-        <w:rPr>
-          <w:b/>
-          <w:bCs/>
-          <w:color w:val="1F4E79"/>
-          <w:sz w:val="56"/>
-          <w:szCs w:val="56"/>
-        </w:rPr>
-        <w:t xml:space="preserve"> Client &amp; Invoice Tracker</w:t>
+        <w:t>TaskDesk Client &amp; Invoice Tracker</w:t>
       </w:r>
     </w:p>
     <w:p>
@@ -94,19 +82,8 @@
         </w:rPr>
         <w:t xml:space="preserve">GitHub Link: </w:t>
       </w:r>
-      <w:hyperlink r:id="rId7" w:history="1">
-        <w:r>
-          <w:rPr>
-            <w:rStyle w:val="Hyperlink"/>
-          </w:rPr>
-          <w:t>https://github.com/Sfayson1/TaskDesk/releases/tag/Phase-1</w:t>
-        </w:r>
-      </w:hyperlink>
-      <w:r>
-        <w:rPr>
-          <w:color w:val="444444"/>
-        </w:rPr>
-        <w:t xml:space="preserve"> </w:t>
+      <w:r>
+        <w:t>https://github.com/Sfayson1/TaskDesk/releases/tag/Phase-2</w:t>
       </w:r>
     </w:p>
     <w:p>
@@ -129,13 +106,8 @@
       <w:pPr>
         <w:spacing w:after="120"/>
       </w:pPr>
-      <w:proofErr w:type="spellStart"/>
-      <w:r>
-        <w:t>TaskDesk</w:t>
-      </w:r>
-      <w:proofErr w:type="spellEnd"/>
-      <w:r>
-        <w:t xml:space="preserve"> Client &amp; Invoice Tracker is a terminal-based C# application designed to help freelancers and self-employed workers manage clients, projects, tasks, and billable work hours. The application supports full create, read, update, and delete (CRUD) operations and produces formatted invoice summaries for billing purposes.</w:t>
+      <w:r>
+        <w:t>TaskDesk Client &amp; Invoice Tracker is a terminal-based C# application designed to help freelancers and self-employed workers manage clients, projects, tasks, and billable work hours. The application supports full create, read, update, and delete (CRUD) operations and produces formatted invoice summaries for billing purposes.</w:t>
       </w:r>
     </w:p>
     <w:p/>
@@ -160,13 +132,8 @@
       <w:pPr>
         <w:spacing w:after="120"/>
       </w:pPr>
-      <w:proofErr w:type="spellStart"/>
-      <w:r>
-        <w:t>TaskDesk</w:t>
-      </w:r>
-      <w:proofErr w:type="spellEnd"/>
-      <w:r>
-        <w:t xml:space="preserve"> solves a real problem many freelancers face: scattered client records, forgotten billable hours, and inconsistent invoicing. The application gives users a single place to:</w:t>
+      <w:r>
+        <w:t>TaskDesk solves a real problem many freelancers face: scattered client records, forgotten billable hours, and inconsistent invoicing. The application gives users a single place to:</w:t>
       </w:r>
     </w:p>
     <w:p>
@@ -366,31 +333,7 @@
         <w:spacing w:after="120"/>
       </w:pPr>
       <w:r>
-        <w:t xml:space="preserve">The following section defines each class and interface in the application. All entity classes inherit from </w:t>
-      </w:r>
-      <w:proofErr w:type="spellStart"/>
-      <w:r>
-        <w:t>BaseEntity</w:t>
-      </w:r>
-      <w:proofErr w:type="spellEnd"/>
-      <w:r>
-        <w:t xml:space="preserve">. The </w:t>
-      </w:r>
-      <w:proofErr w:type="spellStart"/>
-      <w:r>
-        <w:t>IBillable</w:t>
-      </w:r>
-      <w:proofErr w:type="spellEnd"/>
-      <w:r>
-        <w:t xml:space="preserve"> interface is implemented by </w:t>
-      </w:r>
-      <w:proofErr w:type="spellStart"/>
-      <w:r>
-        <w:t>TimeEntry</w:t>
-      </w:r>
-      <w:proofErr w:type="spellEnd"/>
-      <w:r>
-        <w:t xml:space="preserve"> and consumed by Invoice.</w:t>
+        <w:t>The following section defines each class and interface in the application. All entity classes inherit from BaseEntity. The IBillable interface is implemented by TimeEntry and consumed by Invoice.</w:t>
       </w:r>
     </w:p>
     <w:p/>
@@ -426,7 +369,7 @@
                     <pic:cNvPicPr/>
                   </pic:nvPicPr>
                   <pic:blipFill>
-                    <a:blip r:embed="rId8"/>
+                    <a:blip r:embed="rId7"/>
                     <a:stretch>
                       <a:fillRect/>
                     </a:stretch>
@@ -452,15 +395,7 @@
         <w:spacing w:after="120"/>
       </w:pPr>
       <w:r>
-        <w:t xml:space="preserve">The diagram illustrates the full class hierarchy showing inheritance relationships (solid lines with open triangle) and interface implementation (dashed lines with open triangle). </w:t>
-      </w:r>
-      <w:proofErr w:type="spellStart"/>
-      <w:r>
-        <w:t>DatabaseManager</w:t>
-      </w:r>
-      <w:proofErr w:type="spellEnd"/>
-      <w:r>
-        <w:t xml:space="preserve"> is shown separately as a static utility class with no inheritance relationship.</w:t>
+        <w:t>The diagram illustrates the full class hierarchy showing inheritance relationships (solid lines with open triangle) and interface implementation (dashed lines with open triangle). DatabaseManager is shown separately as a static utility class with no inheritance relationship.</w:t>
       </w:r>
     </w:p>
     <w:p/>
@@ -469,15 +404,7 @@
         <w:pStyle w:val="Heading2"/>
       </w:pPr>
       <w:r>
-        <w:t xml:space="preserve">2.2 </w:t>
-      </w:r>
-      <w:proofErr w:type="spellStart"/>
-      <w:r>
-        <w:t>BaseEntity</w:t>
-      </w:r>
-      <w:proofErr w:type="spellEnd"/>
-      <w:r>
-        <w:t xml:space="preserve"> (Abstract Class)</w:t>
+        <w:t>2.2 BaseEntity (Abstract Class)</w:t>
       </w:r>
     </w:p>
     <w:p>
@@ -487,26 +414,13 @@
       <w:r>
         <w:t xml:space="preserve">Acts as the root parent class for all data-holding entities. Defines shared properties and declares </w:t>
       </w:r>
-      <w:proofErr w:type="spellStart"/>
       <w:proofErr w:type="gramStart"/>
       <w:r>
-        <w:t>GetInfo</w:t>
-      </w:r>
-      <w:proofErr w:type="spellEnd"/>
-      <w:r>
-        <w:t>(</w:t>
+        <w:t>GetInfo(</w:t>
       </w:r>
       <w:proofErr w:type="gramEnd"/>
       <w:r>
-        <w:t xml:space="preserve">) as an abstract method that every subclass must implement. </w:t>
-      </w:r>
-      <w:proofErr w:type="spellStart"/>
-      <w:r>
-        <w:t>BaseEntity</w:t>
-      </w:r>
-      <w:proofErr w:type="spellEnd"/>
-      <w:r>
-        <w:t xml:space="preserve"> cannot be instantiated directly.</w:t>
+        <w:t>) as an abstract method that every subclass must implement. BaseEntity cannot be instantiated directly.</w:t>
       </w:r>
     </w:p>
     <w:p/>
@@ -654,23 +568,7 @@
                 <w:sz w:val="20"/>
                 <w:szCs w:val="20"/>
               </w:rPr>
-              <w:t xml:space="preserve">int — public get, public set. Assigned by </w:t>
-            </w:r>
-            <w:proofErr w:type="spellStart"/>
-            <w:r>
-              <w:rPr>
-                <w:sz w:val="20"/>
-                <w:szCs w:val="20"/>
-              </w:rPr>
-              <w:t>DatabaseManager</w:t>
-            </w:r>
-            <w:proofErr w:type="spellEnd"/>
-            <w:r>
-              <w:rPr>
-                <w:sz w:val="20"/>
-                <w:szCs w:val="20"/>
-              </w:rPr>
-              <w:t xml:space="preserve"> on insert.</w:t>
+              <w:t>int — public get, public set. Assigned by DatabaseManager on insert.</w:t>
             </w:r>
           </w:p>
         </w:tc>
@@ -694,7 +592,6 @@
             </w:tcMar>
           </w:tcPr>
           <w:p>
-            <w:proofErr w:type="spellStart"/>
             <w:r>
               <w:rPr>
                 <w:b/>
@@ -704,7 +601,6 @@
               </w:rPr>
               <w:t>CreatedAt</w:t>
             </w:r>
-            <w:proofErr w:type="spellEnd"/>
           </w:p>
         </w:tc>
         <w:tc>
@@ -725,37 +621,12 @@
             </w:tcMar>
           </w:tcPr>
           <w:p>
-            <w:proofErr w:type="spellStart"/>
-            <w:r>
-              <w:rPr>
-                <w:sz w:val="20"/>
-                <w:szCs w:val="20"/>
-              </w:rPr>
-              <w:t>DateTime</w:t>
-            </w:r>
-            <w:proofErr w:type="spellEnd"/>
-            <w:r>
-              <w:rPr>
-                <w:sz w:val="20"/>
-                <w:szCs w:val="20"/>
-              </w:rPr>
-              <w:t xml:space="preserve"> — public get, protected set. Set to </w:t>
-            </w:r>
-            <w:proofErr w:type="spellStart"/>
-            <w:r>
-              <w:rPr>
-                <w:sz w:val="20"/>
-                <w:szCs w:val="20"/>
-              </w:rPr>
-              <w:t>DateTime.Now</w:t>
-            </w:r>
-            <w:proofErr w:type="spellEnd"/>
-            <w:r>
-              <w:rPr>
-                <w:sz w:val="20"/>
-                <w:szCs w:val="20"/>
-              </w:rPr>
-              <w:t xml:space="preserve"> in constructor. Protected set prevents external modification.</w:t>
+            <w:r>
+              <w:rPr>
+                <w:sz w:val="20"/>
+                <w:szCs w:val="20"/>
+              </w:rPr>
+              <w:t>DateTime — public get, protected set. Set to DateTime.Now in constructor. Protected set prevents external modification.</w:t>
             </w:r>
           </w:p>
         </w:tc>
@@ -880,7 +751,6 @@
               </w:rPr>
               <w:t xml:space="preserve">abstract string </w:t>
             </w:r>
-            <w:proofErr w:type="spellStart"/>
             <w:proofErr w:type="gramStart"/>
             <w:r>
               <w:rPr>
@@ -888,16 +758,7 @@
                 <w:sz w:val="20"/>
                 <w:szCs w:val="20"/>
               </w:rPr>
-              <w:t>GetInfo</w:t>
-            </w:r>
-            <w:proofErr w:type="spellEnd"/>
-            <w:r>
-              <w:rPr>
-                <w:rFonts w:ascii="Courier New" w:eastAsia="Courier New" w:hAnsi="Courier New" w:cs="Courier New"/>
-                <w:sz w:val="20"/>
-                <w:szCs w:val="20"/>
-              </w:rPr>
-              <w:t>(</w:t>
+              <w:t>GetInfo(</w:t>
             </w:r>
             <w:proofErr w:type="gramEnd"/>
             <w:r>
@@ -965,7 +826,6 @@
               </w:rPr>
               <w:t xml:space="preserve">override string </w:t>
             </w:r>
-            <w:proofErr w:type="spellStart"/>
             <w:proofErr w:type="gramStart"/>
             <w:r>
               <w:rPr>
@@ -973,16 +833,7 @@
                 <w:sz w:val="20"/>
                 <w:szCs w:val="20"/>
               </w:rPr>
-              <w:t>ToString</w:t>
-            </w:r>
-            <w:proofErr w:type="spellEnd"/>
-            <w:r>
-              <w:rPr>
-                <w:rFonts w:ascii="Courier New" w:eastAsia="Courier New" w:hAnsi="Courier New" w:cs="Courier New"/>
-                <w:sz w:val="20"/>
-                <w:szCs w:val="20"/>
-              </w:rPr>
-              <w:t>(</w:t>
+              <w:t>ToString(</w:t>
             </w:r>
             <w:proofErr w:type="gramEnd"/>
             <w:r>
@@ -1020,22 +871,13 @@
               </w:rPr>
               <w:t xml:space="preserve">Calls </w:t>
             </w:r>
-            <w:proofErr w:type="spellStart"/>
             <w:proofErr w:type="gramStart"/>
             <w:r>
               <w:rPr>
                 <w:sz w:val="20"/>
                 <w:szCs w:val="20"/>
               </w:rPr>
-              <w:t>GetInfo</w:t>
-            </w:r>
-            <w:proofErr w:type="spellEnd"/>
-            <w:r>
-              <w:rPr>
-                <w:sz w:val="20"/>
-                <w:szCs w:val="20"/>
-              </w:rPr>
-              <w:t>(</w:t>
+              <w:t>GetInfo(</w:t>
             </w:r>
             <w:proofErr w:type="gramEnd"/>
             <w:r>
@@ -1043,39 +885,7 @@
                 <w:sz w:val="20"/>
                 <w:szCs w:val="20"/>
               </w:rPr>
-              <w:t xml:space="preserve">) so any </w:t>
-            </w:r>
-            <w:proofErr w:type="spellStart"/>
-            <w:r>
-              <w:rPr>
-                <w:sz w:val="20"/>
-                <w:szCs w:val="20"/>
-              </w:rPr>
-              <w:t>BaseEntity</w:t>
-            </w:r>
-            <w:proofErr w:type="spellEnd"/>
-            <w:r>
-              <w:rPr>
-                <w:sz w:val="20"/>
-                <w:szCs w:val="20"/>
-              </w:rPr>
-              <w:t xml:space="preserve"> subclass prints correctly when passed to </w:t>
-            </w:r>
-            <w:proofErr w:type="spellStart"/>
-            <w:r>
-              <w:rPr>
-                <w:sz w:val="20"/>
-                <w:szCs w:val="20"/>
-              </w:rPr>
-              <w:t>Console.WriteLine</w:t>
-            </w:r>
-            <w:proofErr w:type="spellEnd"/>
-            <w:r>
-              <w:rPr>
-                <w:sz w:val="20"/>
-                <w:szCs w:val="20"/>
-              </w:rPr>
-              <w:t>.</w:t>
+              <w:t>) so any BaseEntity subclass prints correctly when passed to Console.WriteLine.</w:t>
             </w:r>
           </w:p>
         </w:tc>
@@ -1100,15 +910,7 @@
         <w:spacing w:after="80"/>
       </w:pPr>
       <w:r>
-        <w:t xml:space="preserve">Demonstrates abstraction — </w:t>
-      </w:r>
-      <w:proofErr w:type="spellStart"/>
-      <w:r>
-        <w:t>BaseEntity</w:t>
-      </w:r>
-      <w:proofErr w:type="spellEnd"/>
-      <w:r>
-        <w:t xml:space="preserve"> defines the contract; subclasses provide the implementation.</w:t>
+        <w:t>Demonstrates abstraction — BaseEntity defines the contract; subclasses provide the implementation.</w:t>
       </w:r>
     </w:p>
     <w:p>
@@ -1123,14 +925,9 @@
       <w:r>
         <w:t xml:space="preserve">Uses the abstract keyword; cannot be instantiated with new </w:t>
       </w:r>
-      <w:proofErr w:type="spellStart"/>
       <w:proofErr w:type="gramStart"/>
       <w:r>
-        <w:t>BaseEntity</w:t>
-      </w:r>
-      <w:proofErr w:type="spellEnd"/>
-      <w:r>
-        <w:t>(</w:t>
+        <w:t>BaseEntity(</w:t>
       </w:r>
       <w:proofErr w:type="gramEnd"/>
       <w:r>
@@ -1146,13 +943,8 @@
         </w:numPr>
         <w:spacing w:after="80"/>
       </w:pPr>
-      <w:proofErr w:type="spellStart"/>
-      <w:r>
-        <w:t>CreatedAt</w:t>
-      </w:r>
-      <w:proofErr w:type="spellEnd"/>
-      <w:r>
-        <w:t xml:space="preserve"> uses protected set so subclasses inherit </w:t>
+      <w:r>
+        <w:t xml:space="preserve">CreatedAt uses protected set so subclasses inherit </w:t>
       </w:r>
       <w:proofErr w:type="gramStart"/>
       <w:r>
@@ -1175,14 +967,9 @@
       <w:r>
         <w:t xml:space="preserve">Polymorphism: </w:t>
       </w:r>
-      <w:proofErr w:type="spellStart"/>
       <w:proofErr w:type="gramStart"/>
       <w:r>
-        <w:t>GetInfo</w:t>
-      </w:r>
-      <w:proofErr w:type="spellEnd"/>
-      <w:r>
-        <w:t>(</w:t>
+        <w:t>GetInfo(</w:t>
       </w:r>
       <w:proofErr w:type="gramEnd"/>
       <w:r>
@@ -1203,15 +990,7 @@
         <w:spacing w:after="120"/>
       </w:pPr>
       <w:r>
-        <w:t xml:space="preserve">Represents a client in the system. Stores contact information and links to one or more projects via </w:t>
-      </w:r>
-      <w:proofErr w:type="spellStart"/>
-      <w:r>
-        <w:t>ClientId</w:t>
-      </w:r>
-      <w:proofErr w:type="spellEnd"/>
-      <w:r>
-        <w:t xml:space="preserve"> foreign key.</w:t>
+        <w:t>Represents a client in the system. Stores contact information and links to one or more projects via ClientId foreign key.</w:t>
       </w:r>
     </w:p>
     <w:p/>
@@ -1441,7 +1220,6 @@
             </w:tcMar>
           </w:tcPr>
           <w:p>
-            <w:proofErr w:type="spellStart"/>
             <w:r>
               <w:rPr>
                 <w:b/>
@@ -1451,7 +1229,6 @@
               </w:rPr>
               <w:t>PhoneNumber</w:t>
             </w:r>
-            <w:proofErr w:type="spellEnd"/>
           </w:p>
         </w:tc>
         <w:tc>
@@ -1602,7 +1379,6 @@
               </w:rPr>
               <w:t xml:space="preserve">override string </w:t>
             </w:r>
-            <w:proofErr w:type="spellStart"/>
             <w:proofErr w:type="gramStart"/>
             <w:r>
               <w:rPr>
@@ -1610,16 +1386,7 @@
                 <w:sz w:val="20"/>
                 <w:szCs w:val="20"/>
               </w:rPr>
-              <w:t>GetInfo</w:t>
-            </w:r>
-            <w:proofErr w:type="spellEnd"/>
-            <w:r>
-              <w:rPr>
-                <w:rFonts w:ascii="Courier New" w:eastAsia="Courier New" w:hAnsi="Courier New" w:cs="Courier New"/>
-                <w:sz w:val="20"/>
-                <w:szCs w:val="20"/>
-              </w:rPr>
-              <w:t>(</w:t>
+              <w:t>GetInfo(</w:t>
             </w:r>
             <w:proofErr w:type="gramEnd"/>
             <w:r>
@@ -1687,7 +1454,6 @@
               </w:rPr>
               <w:t xml:space="preserve">override string </w:t>
             </w:r>
-            <w:proofErr w:type="spellStart"/>
             <w:proofErr w:type="gramStart"/>
             <w:r>
               <w:rPr>
@@ -1695,16 +1461,7 @@
                 <w:sz w:val="20"/>
                 <w:szCs w:val="20"/>
               </w:rPr>
-              <w:t>ToString</w:t>
-            </w:r>
-            <w:proofErr w:type="spellEnd"/>
-            <w:r>
-              <w:rPr>
-                <w:rFonts w:ascii="Courier New" w:eastAsia="Courier New" w:hAnsi="Courier New" w:cs="Courier New"/>
-                <w:sz w:val="20"/>
-                <w:szCs w:val="20"/>
-              </w:rPr>
-              <w:t>(</w:t>
+              <w:t>ToString(</w:t>
             </w:r>
             <w:proofErr w:type="gramEnd"/>
             <w:r>
@@ -1765,15 +1522,7 @@
         <w:spacing w:after="80"/>
       </w:pPr>
       <w:r>
-        <w:t xml:space="preserve">Inherits from </w:t>
-      </w:r>
-      <w:proofErr w:type="spellStart"/>
-      <w:r>
-        <w:t>BaseEntity</w:t>
-      </w:r>
-      <w:proofErr w:type="spellEnd"/>
-      <w:r>
-        <w:t>. Demonstrates inheritance.</w:t>
+        <w:t>Inherits from BaseEntity. Demonstrates inheritance.</w:t>
       </w:r>
     </w:p>
     <w:p>
@@ -1788,14 +1537,9 @@
       <w:r>
         <w:t xml:space="preserve">Overrides </w:t>
       </w:r>
-      <w:proofErr w:type="spellStart"/>
       <w:proofErr w:type="gramStart"/>
       <w:r>
-        <w:t>GetInfo</w:t>
-      </w:r>
-      <w:proofErr w:type="spellEnd"/>
-      <w:r>
-        <w:t>(</w:t>
+        <w:t>GetInfo(</w:t>
       </w:r>
       <w:proofErr w:type="gramEnd"/>
       <w:r>
@@ -1812,15 +1556,7 @@
         <w:spacing w:after="80"/>
       </w:pPr>
       <w:r>
-        <w:t xml:space="preserve">A single Client can be associated with many Project records (one-to-many, enforced via </w:t>
-      </w:r>
-      <w:proofErr w:type="spellStart"/>
-      <w:r>
-        <w:t>ClientId</w:t>
-      </w:r>
-      <w:proofErr w:type="spellEnd"/>
-      <w:r>
-        <w:t xml:space="preserve"> foreign key in the Projects table).</w:t>
+        <w:t>A single Client can be associated with many Project records (one-to-many, enforced via ClientId foreign key in the Projects table).</w:t>
       </w:r>
     </w:p>
     <w:p/>
@@ -1951,7 +1687,6 @@
             </w:tcMar>
           </w:tcPr>
           <w:p>
-            <w:proofErr w:type="spellStart"/>
             <w:r>
               <w:rPr>
                 <w:b/>
@@ -1961,7 +1696,6 @@
               </w:rPr>
               <w:t>ProjectName</w:t>
             </w:r>
-            <w:proofErr w:type="spellEnd"/>
           </w:p>
         </w:tc>
         <w:tc>
@@ -2011,7 +1745,6 @@
             </w:tcMar>
           </w:tcPr>
           <w:p>
-            <w:proofErr w:type="spellStart"/>
             <w:r>
               <w:rPr>
                 <w:b/>
@@ -2021,7 +1754,6 @@
               </w:rPr>
               <w:t>HourlyRate</w:t>
             </w:r>
-            <w:proofErr w:type="spellEnd"/>
           </w:p>
         </w:tc>
         <w:tc>
@@ -2129,7 +1861,6 @@
             </w:tcMar>
           </w:tcPr>
           <w:p>
-            <w:proofErr w:type="spellStart"/>
             <w:r>
               <w:rPr>
                 <w:b/>
@@ -2139,7 +1870,6 @@
               </w:rPr>
               <w:t>ClientId</w:t>
             </w:r>
-            <w:proofErr w:type="spellEnd"/>
           </w:p>
         </w:tc>
         <w:tc>
@@ -2165,17 +1895,8 @@
                 <w:sz w:val="20"/>
                 <w:szCs w:val="20"/>
               </w:rPr>
-              <w:t xml:space="preserve">int — public, foreign key reference to </w:t>
-            </w:r>
-            <w:proofErr w:type="spellStart"/>
-            <w:r>
-              <w:rPr>
-                <w:sz w:val="20"/>
-                <w:szCs w:val="20"/>
-              </w:rPr>
-              <w:t>Client.Id</w:t>
-            </w:r>
-            <w:proofErr w:type="spellEnd"/>
+              <w:t>int — public, foreign key reference to Client.Id</w:t>
+            </w:r>
           </w:p>
         </w:tc>
       </w:tr>
@@ -2299,7 +2020,6 @@
               </w:rPr>
               <w:t xml:space="preserve">override string </w:t>
             </w:r>
-            <w:proofErr w:type="spellStart"/>
             <w:proofErr w:type="gramStart"/>
             <w:r>
               <w:rPr>
@@ -2307,16 +2027,7 @@
                 <w:sz w:val="20"/>
                 <w:szCs w:val="20"/>
               </w:rPr>
-              <w:t>GetInfo</w:t>
-            </w:r>
-            <w:proofErr w:type="spellEnd"/>
-            <w:r>
-              <w:rPr>
-                <w:rFonts w:ascii="Courier New" w:eastAsia="Courier New" w:hAnsi="Courier New" w:cs="Courier New"/>
-                <w:sz w:val="20"/>
-                <w:szCs w:val="20"/>
-              </w:rPr>
-              <w:t>(</w:t>
+              <w:t>GetInfo(</w:t>
             </w:r>
             <w:proofErr w:type="gramEnd"/>
             <w:r>
@@ -2384,7 +2095,6 @@
               </w:rPr>
               <w:t xml:space="preserve">override string </w:t>
             </w:r>
-            <w:proofErr w:type="spellStart"/>
             <w:proofErr w:type="gramStart"/>
             <w:r>
               <w:rPr>
@@ -2392,16 +2102,7 @@
                 <w:sz w:val="20"/>
                 <w:szCs w:val="20"/>
               </w:rPr>
-              <w:t>ToString</w:t>
-            </w:r>
-            <w:proofErr w:type="spellEnd"/>
-            <w:r>
-              <w:rPr>
-                <w:rFonts w:ascii="Courier New" w:eastAsia="Courier New" w:hAnsi="Courier New" w:cs="Courier New"/>
-                <w:sz w:val="20"/>
-                <w:szCs w:val="20"/>
-              </w:rPr>
-              <w:t>(</w:t>
+              <w:t>ToString(</w:t>
             </w:r>
             <w:proofErr w:type="gramEnd"/>
             <w:r>
@@ -2462,15 +2163,7 @@
         <w:spacing w:after="80"/>
       </w:pPr>
       <w:r>
-        <w:t xml:space="preserve">Inherits from </w:t>
-      </w:r>
-      <w:proofErr w:type="spellStart"/>
-      <w:r>
-        <w:t>BaseEntity</w:t>
-      </w:r>
-      <w:proofErr w:type="spellEnd"/>
-      <w:r>
-        <w:t>.</w:t>
+        <w:t>Inherits from BaseEntity.</w:t>
       </w:r>
     </w:p>
     <w:p>
@@ -2504,15 +2197,7 @@
         <w:spacing w:after="80"/>
       </w:pPr>
       <w:r>
-        <w:t xml:space="preserve">Status is a string rather than an </w:t>
-      </w:r>
-      <w:proofErr w:type="spellStart"/>
-      <w:r>
-        <w:t>enum</w:t>
-      </w:r>
-      <w:proofErr w:type="spellEnd"/>
-      <w:r>
-        <w:t xml:space="preserve"> for simplicity; values are validated on input.</w:t>
+        <w:t>Status is a string rather than an enum for simplicity; values are validated on input.</w:t>
       </w:r>
     </w:p>
     <w:p/>
@@ -2522,15 +2207,7 @@
       </w:pPr>
       <w:r>
         <w:lastRenderedPageBreak/>
-        <w:t xml:space="preserve">2.5 </w:t>
-      </w:r>
-      <w:proofErr w:type="spellStart"/>
-      <w:r>
-        <w:t>TaskItem</w:t>
-      </w:r>
-      <w:proofErr w:type="spellEnd"/>
-      <w:r>
-        <w:t xml:space="preserve"> Class</w:t>
+        <w:t>2.5 TaskItem Class</w:t>
       </w:r>
     </w:p>
     <w:p>
@@ -2768,7 +2445,6 @@
             </w:tcMar>
           </w:tcPr>
           <w:p>
-            <w:proofErr w:type="spellStart"/>
             <w:r>
               <w:rPr>
                 <w:b/>
@@ -2778,7 +2454,6 @@
               </w:rPr>
               <w:t>IsCompleted</w:t>
             </w:r>
-            <w:proofErr w:type="spellEnd"/>
           </w:p>
         </w:tc>
         <w:tc>
@@ -2828,7 +2503,6 @@
             </w:tcMar>
           </w:tcPr>
           <w:p>
-            <w:proofErr w:type="spellStart"/>
             <w:r>
               <w:rPr>
                 <w:b/>
@@ -2838,7 +2512,6 @@
               </w:rPr>
               <w:t>ProjectId</w:t>
             </w:r>
-            <w:proofErr w:type="spellEnd"/>
           </w:p>
         </w:tc>
         <w:tc>
@@ -2864,17 +2537,8 @@
                 <w:sz w:val="20"/>
                 <w:szCs w:val="20"/>
               </w:rPr>
-              <w:t xml:space="preserve">int — public, foreign key reference to </w:t>
-            </w:r>
-            <w:proofErr w:type="spellStart"/>
-            <w:r>
-              <w:rPr>
-                <w:sz w:val="20"/>
-                <w:szCs w:val="20"/>
-              </w:rPr>
-              <w:t>Project.Id</w:t>
-            </w:r>
-            <w:proofErr w:type="spellEnd"/>
+              <w:t>int — public, foreign key reference to Project.Id</w:t>
+            </w:r>
           </w:p>
         </w:tc>
       </w:tr>
@@ -2998,7 +2662,6 @@
               </w:rPr>
               <w:t xml:space="preserve">void </w:t>
             </w:r>
-            <w:proofErr w:type="spellStart"/>
             <w:proofErr w:type="gramStart"/>
             <w:r>
               <w:rPr>
@@ -3006,16 +2669,7 @@
                 <w:sz w:val="20"/>
                 <w:szCs w:val="20"/>
               </w:rPr>
-              <w:t>MarkComplete</w:t>
-            </w:r>
-            <w:proofErr w:type="spellEnd"/>
-            <w:r>
-              <w:rPr>
-                <w:rFonts w:ascii="Courier New" w:eastAsia="Courier New" w:hAnsi="Courier New" w:cs="Courier New"/>
-                <w:sz w:val="20"/>
-                <w:szCs w:val="20"/>
-              </w:rPr>
-              <w:t>(</w:t>
+              <w:t>MarkComplete(</w:t>
             </w:r>
             <w:proofErr w:type="gramEnd"/>
             <w:r>
@@ -3051,39 +2705,7 @@
                 <w:sz w:val="20"/>
                 <w:szCs w:val="20"/>
               </w:rPr>
-              <w:t xml:space="preserve">Sets </w:t>
-            </w:r>
-            <w:proofErr w:type="spellStart"/>
-            <w:r>
-              <w:rPr>
-                <w:sz w:val="20"/>
-                <w:szCs w:val="20"/>
-              </w:rPr>
-              <w:t>IsCompleted</w:t>
-            </w:r>
-            <w:proofErr w:type="spellEnd"/>
-            <w:r>
-              <w:rPr>
-                <w:sz w:val="20"/>
-                <w:szCs w:val="20"/>
-              </w:rPr>
-              <w:t xml:space="preserve"> = true. In Phase 2, will also call </w:t>
-            </w:r>
-            <w:proofErr w:type="spellStart"/>
-            <w:r>
-              <w:rPr>
-                <w:sz w:val="20"/>
-                <w:szCs w:val="20"/>
-              </w:rPr>
-              <w:t>DatabaseManager</w:t>
-            </w:r>
-            <w:proofErr w:type="spellEnd"/>
-            <w:r>
-              <w:rPr>
-                <w:sz w:val="20"/>
-                <w:szCs w:val="20"/>
-              </w:rPr>
-              <w:t xml:space="preserve"> to persist the change.</w:t>
+              <w:t>Sets IsCompleted = true. In Phase 2, will also call DatabaseManager to persist the change.</w:t>
             </w:r>
           </w:p>
         </w:tc>
@@ -3115,7 +2737,6 @@
               </w:rPr>
               <w:t xml:space="preserve">override string </w:t>
             </w:r>
-            <w:proofErr w:type="spellStart"/>
             <w:proofErr w:type="gramStart"/>
             <w:r>
               <w:rPr>
@@ -3123,16 +2744,7 @@
                 <w:sz w:val="20"/>
                 <w:szCs w:val="20"/>
               </w:rPr>
-              <w:t>GetInfo</w:t>
-            </w:r>
-            <w:proofErr w:type="spellEnd"/>
-            <w:r>
-              <w:rPr>
-                <w:rFonts w:ascii="Courier New" w:eastAsia="Courier New" w:hAnsi="Courier New" w:cs="Courier New"/>
-                <w:sz w:val="20"/>
-                <w:szCs w:val="20"/>
-              </w:rPr>
-              <w:t>(</w:t>
+              <w:t>GetInfo(</w:t>
             </w:r>
             <w:proofErr w:type="gramEnd"/>
             <w:r>
@@ -3200,7 +2812,6 @@
               </w:rPr>
               <w:t xml:space="preserve">override string </w:t>
             </w:r>
-            <w:proofErr w:type="spellStart"/>
             <w:proofErr w:type="gramStart"/>
             <w:r>
               <w:rPr>
@@ -3208,16 +2819,7 @@
                 <w:sz w:val="20"/>
                 <w:szCs w:val="20"/>
               </w:rPr>
-              <w:t>ToString</w:t>
-            </w:r>
-            <w:proofErr w:type="spellEnd"/>
-            <w:r>
-              <w:rPr>
-                <w:rFonts w:ascii="Courier New" w:eastAsia="Courier New" w:hAnsi="Courier New" w:cs="Courier New"/>
-                <w:sz w:val="20"/>
-                <w:szCs w:val="20"/>
-              </w:rPr>
-              <w:t>(</w:t>
+              <w:t>ToString(</w:t>
             </w:r>
             <w:proofErr w:type="gramEnd"/>
             <w:r>
@@ -3278,15 +2880,7 @@
         <w:spacing w:after="80"/>
       </w:pPr>
       <w:r>
-        <w:t xml:space="preserve">Inherits from </w:t>
-      </w:r>
-      <w:proofErr w:type="spellStart"/>
-      <w:r>
-        <w:t>BaseEntity</w:t>
-      </w:r>
-      <w:proofErr w:type="spellEnd"/>
-      <w:r>
-        <w:t>.</w:t>
+        <w:t>Inherits from BaseEntity.</w:t>
       </w:r>
     </w:p>
     <w:p>
@@ -3298,14 +2892,9 @@
         </w:numPr>
         <w:spacing w:after="80"/>
       </w:pPr>
-      <w:proofErr w:type="spellStart"/>
       <w:proofErr w:type="gramStart"/>
       <w:r>
-        <w:t>MarkComplete</w:t>
-      </w:r>
-      <w:proofErr w:type="spellEnd"/>
-      <w:r>
-        <w:t>(</w:t>
+        <w:t>MarkComplete(</w:t>
       </w:r>
       <w:proofErr w:type="gramEnd"/>
       <w:r>
@@ -3321,13 +2910,8 @@
         </w:numPr>
         <w:spacing w:after="80"/>
       </w:pPr>
-      <w:proofErr w:type="spellStart"/>
-      <w:r>
-        <w:t>IsCompleted</w:t>
-      </w:r>
-      <w:proofErr w:type="spellEnd"/>
-      <w:r>
-        <w:t xml:space="preserve"> is stored in SQLite as INTEGER (0 or 1) and mapped to bool in C#.</w:t>
+      <w:r>
+        <w:t>IsCompleted is stored in SQLite as INTEGER (0 or 1) and mapped to bool in C#.</w:t>
       </w:r>
     </w:p>
     <w:p/>
@@ -3336,15 +2920,7 @@
         <w:pStyle w:val="Heading2"/>
       </w:pPr>
       <w:r>
-        <w:t xml:space="preserve">2.6 </w:t>
-      </w:r>
-      <w:proofErr w:type="spellStart"/>
-      <w:r>
-        <w:t>IBillable</w:t>
-      </w:r>
-      <w:proofErr w:type="spellEnd"/>
-      <w:r>
-        <w:t xml:space="preserve"> Interface</w:t>
+        <w:t>2.6 IBillable Interface</w:t>
       </w:r>
     </w:p>
     <w:p>
@@ -3474,7 +3050,6 @@
               </w:rPr>
               <w:t xml:space="preserve">decimal </w:t>
             </w:r>
-            <w:proofErr w:type="spellStart"/>
             <w:proofErr w:type="gramStart"/>
             <w:r>
               <w:rPr>
@@ -3482,16 +3057,7 @@
                 <w:sz w:val="20"/>
                 <w:szCs w:val="20"/>
               </w:rPr>
-              <w:t>CalculateTotal</w:t>
-            </w:r>
-            <w:proofErr w:type="spellEnd"/>
-            <w:r>
-              <w:rPr>
-                <w:rFonts w:ascii="Courier New" w:eastAsia="Courier New" w:hAnsi="Courier New" w:cs="Courier New"/>
-                <w:sz w:val="20"/>
-                <w:szCs w:val="20"/>
-              </w:rPr>
-              <w:t>(</w:t>
+              <w:t>CalculateTotal(</w:t>
             </w:r>
             <w:proofErr w:type="gramEnd"/>
             <w:r>
@@ -3564,21 +3130,8 @@
         </w:numPr>
         <w:spacing w:after="80"/>
       </w:pPr>
-      <w:proofErr w:type="spellStart"/>
-      <w:r>
-        <w:t>TimeEntry</w:t>
-      </w:r>
-      <w:proofErr w:type="spellEnd"/>
-      <w:r>
-        <w:t xml:space="preserve"> implements </w:t>
-      </w:r>
-      <w:proofErr w:type="spellStart"/>
-      <w:r>
-        <w:t>IBillable</w:t>
-      </w:r>
-      <w:proofErr w:type="spellEnd"/>
-      <w:r>
-        <w:t xml:space="preserve"> directly.</w:t>
+      <w:r>
+        <w:t>TimeEntry implements IBillable directly.</w:t>
       </w:r>
     </w:p>
     <w:p>
@@ -3592,32 +3145,11 @@
       </w:pPr>
       <w:r>
         <w:lastRenderedPageBreak/>
-        <w:t xml:space="preserve">Invoice uses </w:t>
-      </w:r>
-      <w:proofErr w:type="spellStart"/>
-      <w:r>
-        <w:t>IBillable</w:t>
-      </w:r>
-      <w:proofErr w:type="spellEnd"/>
-      <w:r>
-        <w:t xml:space="preserve"> by iterating over its List&lt;</w:t>
-      </w:r>
-      <w:proofErr w:type="spellStart"/>
-      <w:r>
-        <w:t>TimeEntry</w:t>
-      </w:r>
-      <w:proofErr w:type="spellEnd"/>
-      <w:r>
-        <w:t xml:space="preserve">&gt; and summing </w:t>
-      </w:r>
-      <w:proofErr w:type="spellStart"/>
+        <w:t xml:space="preserve">Invoice uses IBillable by iterating over its List&lt;TimeEntry&gt; and summing </w:t>
+      </w:r>
       <w:proofErr w:type="gramStart"/>
       <w:r>
-        <w:t>CalculateTotal</w:t>
-      </w:r>
-      <w:proofErr w:type="spellEnd"/>
-      <w:r>
-        <w:t>(</w:t>
+        <w:t>CalculateTotal(</w:t>
       </w:r>
       <w:proofErr w:type="gramEnd"/>
       <w:r>
@@ -3634,15 +3166,7 @@
         <w:spacing w:after="80"/>
       </w:pPr>
       <w:r>
-        <w:t xml:space="preserve">The interface allows future classes (e.g., Expense, </w:t>
-      </w:r>
-      <w:proofErr w:type="spellStart"/>
-      <w:r>
-        <w:t>RetainerEntry</w:t>
-      </w:r>
-      <w:proofErr w:type="spellEnd"/>
-      <w:r>
-        <w:t>) to plug into the invoice system without changing Invoice.</w:t>
+        <w:t>The interface allows future classes (e.g., Expense, RetainerEntry) to plug into the invoice system without changing Invoice.</w:t>
       </w:r>
     </w:p>
     <w:p/>
@@ -3651,15 +3175,7 @@
         <w:pStyle w:val="Heading2"/>
       </w:pPr>
       <w:r>
-        <w:t xml:space="preserve">2.7 </w:t>
-      </w:r>
-      <w:proofErr w:type="spellStart"/>
-      <w:r>
-        <w:t>TimeEntry</w:t>
-      </w:r>
-      <w:proofErr w:type="spellEnd"/>
-      <w:r>
-        <w:t xml:space="preserve"> Class</w:t>
+        <w:t>2.7 TimeEntry Class</w:t>
       </w:r>
     </w:p>
     <w:p>
@@ -3667,15 +3183,7 @@
         <w:spacing w:after="120"/>
       </w:pPr>
       <w:r>
-        <w:t xml:space="preserve">Records a single block of billable work time tied to a project. Implements </w:t>
-      </w:r>
-      <w:proofErr w:type="spellStart"/>
-      <w:r>
-        <w:t>IBillable</w:t>
-      </w:r>
-      <w:proofErr w:type="spellEnd"/>
-      <w:r>
-        <w:t xml:space="preserve"> to calculate its individual cost.</w:t>
+        <w:t>Records a single block of billable work time tied to a project. Implements IBillable to calculate its individual cost.</w:t>
       </w:r>
     </w:p>
     <w:p/>
@@ -3789,7 +3297,6 @@
             </w:tcMar>
           </w:tcPr>
           <w:p>
-            <w:proofErr w:type="spellStart"/>
             <w:r>
               <w:rPr>
                 <w:b/>
@@ -3799,7 +3306,6 @@
               </w:rPr>
               <w:t>HoursWorked</w:t>
             </w:r>
-            <w:proofErr w:type="spellEnd"/>
           </w:p>
         </w:tc>
         <w:tc>
@@ -3849,7 +3355,6 @@
             </w:tcMar>
           </w:tcPr>
           <w:p>
-            <w:proofErr w:type="spellStart"/>
             <w:r>
               <w:rPr>
                 <w:b/>
@@ -3859,7 +3364,6 @@
               </w:rPr>
               <w:t>HourlyRate</w:t>
             </w:r>
-            <w:proofErr w:type="spellEnd"/>
           </w:p>
         </w:tc>
         <w:tc>
@@ -3909,7 +3413,6 @@
             </w:tcMar>
           </w:tcPr>
           <w:p>
-            <w:proofErr w:type="spellStart"/>
             <w:r>
               <w:rPr>
                 <w:b/>
@@ -3919,7 +3422,6 @@
               </w:rPr>
               <w:t>WorkDescription</w:t>
             </w:r>
-            <w:proofErr w:type="spellEnd"/>
           </w:p>
         </w:tc>
         <w:tc>
@@ -3969,7 +3471,6 @@
             </w:tcMar>
           </w:tcPr>
           <w:p>
-            <w:proofErr w:type="spellStart"/>
             <w:r>
               <w:rPr>
                 <w:b/>
@@ -3979,7 +3480,6 @@
               </w:rPr>
               <w:t>ProjectId</w:t>
             </w:r>
-            <w:proofErr w:type="spellEnd"/>
           </w:p>
         </w:tc>
         <w:tc>
@@ -4005,17 +3505,8 @@
                 <w:sz w:val="20"/>
                 <w:szCs w:val="20"/>
               </w:rPr>
-              <w:t xml:space="preserve">int — public, foreign key reference to </w:t>
-            </w:r>
-            <w:proofErr w:type="spellStart"/>
-            <w:r>
-              <w:rPr>
-                <w:sz w:val="20"/>
-                <w:szCs w:val="20"/>
-              </w:rPr>
-              <w:t>Project.Id</w:t>
-            </w:r>
-            <w:proofErr w:type="spellEnd"/>
+              <w:t>int — public, foreign key reference to Project.Id</w:t>
+            </w:r>
           </w:p>
         </w:tc>
       </w:tr>
@@ -4139,7 +3630,6 @@
               </w:rPr>
               <w:t xml:space="preserve">decimal </w:t>
             </w:r>
-            <w:proofErr w:type="spellStart"/>
             <w:proofErr w:type="gramStart"/>
             <w:r>
               <w:rPr>
@@ -4147,16 +3637,7 @@
                 <w:sz w:val="20"/>
                 <w:szCs w:val="20"/>
               </w:rPr>
-              <w:t>CalculateTotal</w:t>
-            </w:r>
-            <w:proofErr w:type="spellEnd"/>
-            <w:r>
-              <w:rPr>
-                <w:rFonts w:ascii="Courier New" w:eastAsia="Courier New" w:hAnsi="Courier New" w:cs="Courier New"/>
-                <w:sz w:val="20"/>
-                <w:szCs w:val="20"/>
-              </w:rPr>
-              <w:t>(</w:t>
+              <w:t>CalculateTotal(</w:t>
             </w:r>
             <w:proofErr w:type="gramEnd"/>
             <w:r>
@@ -4192,55 +3673,7 @@
                 <w:sz w:val="20"/>
                 <w:szCs w:val="20"/>
               </w:rPr>
-              <w:t>Returns (decimal)</w:t>
-            </w:r>
-            <w:proofErr w:type="spellStart"/>
-            <w:r>
-              <w:rPr>
-                <w:sz w:val="20"/>
-                <w:szCs w:val="20"/>
-              </w:rPr>
-              <w:t>HoursWorked</w:t>
-            </w:r>
-            <w:proofErr w:type="spellEnd"/>
-            <w:r>
-              <w:rPr>
-                <w:sz w:val="20"/>
-                <w:szCs w:val="20"/>
-              </w:rPr>
-              <w:t xml:space="preserve"> * </w:t>
-            </w:r>
-            <w:proofErr w:type="spellStart"/>
-            <w:r>
-              <w:rPr>
-                <w:sz w:val="20"/>
-                <w:szCs w:val="20"/>
-              </w:rPr>
-              <w:t>HourlyRate</w:t>
-            </w:r>
-            <w:proofErr w:type="spellEnd"/>
-            <w:r>
-              <w:rPr>
-                <w:sz w:val="20"/>
-                <w:szCs w:val="20"/>
-              </w:rPr>
-              <w:t xml:space="preserve">. Implements </w:t>
-            </w:r>
-            <w:proofErr w:type="spellStart"/>
-            <w:r>
-              <w:rPr>
-                <w:sz w:val="20"/>
-                <w:szCs w:val="20"/>
-              </w:rPr>
-              <w:t>IBillable</w:t>
-            </w:r>
-            <w:proofErr w:type="spellEnd"/>
-            <w:r>
-              <w:rPr>
-                <w:sz w:val="20"/>
-                <w:szCs w:val="20"/>
-              </w:rPr>
-              <w:t>.</w:t>
+              <w:t>Returns (decimal)HoursWorked * HourlyRate. Implements IBillable.</w:t>
             </w:r>
           </w:p>
         </w:tc>
@@ -4272,7 +3705,6 @@
               </w:rPr>
               <w:t xml:space="preserve">override string </w:t>
             </w:r>
-            <w:proofErr w:type="spellStart"/>
             <w:proofErr w:type="gramStart"/>
             <w:r>
               <w:rPr>
@@ -4280,16 +3712,7 @@
                 <w:sz w:val="20"/>
                 <w:szCs w:val="20"/>
               </w:rPr>
-              <w:t>GetInfo</w:t>
-            </w:r>
-            <w:proofErr w:type="spellEnd"/>
-            <w:r>
-              <w:rPr>
-                <w:rFonts w:ascii="Courier New" w:eastAsia="Courier New" w:hAnsi="Courier New" w:cs="Courier New"/>
-                <w:sz w:val="20"/>
-                <w:szCs w:val="20"/>
-              </w:rPr>
-              <w:t>(</w:t>
+              <w:t>GetInfo(</w:t>
             </w:r>
             <w:proofErr w:type="gramEnd"/>
             <w:r>
@@ -4357,7 +3780,6 @@
               </w:rPr>
               <w:t xml:space="preserve">override string </w:t>
             </w:r>
-            <w:proofErr w:type="spellStart"/>
             <w:proofErr w:type="gramStart"/>
             <w:r>
               <w:rPr>
@@ -4365,16 +3787,7 @@
                 <w:sz w:val="20"/>
                 <w:szCs w:val="20"/>
               </w:rPr>
-              <w:t>ToString</w:t>
-            </w:r>
-            <w:proofErr w:type="spellEnd"/>
-            <w:r>
-              <w:rPr>
-                <w:rFonts w:ascii="Courier New" w:eastAsia="Courier New" w:hAnsi="Courier New" w:cs="Courier New"/>
-                <w:sz w:val="20"/>
-                <w:szCs w:val="20"/>
-              </w:rPr>
-              <w:t>(</w:t>
+              <w:t>ToString(</w:t>
             </w:r>
             <w:proofErr w:type="gramEnd"/>
             <w:r>
@@ -4435,23 +3848,7 @@
         <w:spacing w:after="80"/>
       </w:pPr>
       <w:r>
-        <w:t xml:space="preserve">Inherits from </w:t>
-      </w:r>
-      <w:proofErr w:type="spellStart"/>
-      <w:r>
-        <w:t>BaseEntity</w:t>
-      </w:r>
-      <w:proofErr w:type="spellEnd"/>
-      <w:r>
-        <w:t xml:space="preserve"> and implements </w:t>
-      </w:r>
-      <w:proofErr w:type="spellStart"/>
-      <w:r>
-        <w:t>IBillable</w:t>
-      </w:r>
-      <w:proofErr w:type="spellEnd"/>
-      <w:r>
-        <w:t xml:space="preserve"> — demonstrates both inheritance and interface implementation.</w:t>
+        <w:t>Inherits from BaseEntity and implements IBillable — demonstrates both inheritance and interface implementation.</w:t>
       </w:r>
     </w:p>
     <w:p>
@@ -4463,13 +3860,8 @@
         </w:numPr>
         <w:spacing w:after="80"/>
       </w:pPr>
-      <w:proofErr w:type="spellStart"/>
-      <w:r>
-        <w:t>HoursWorked</w:t>
-      </w:r>
-      <w:proofErr w:type="spellEnd"/>
-      <w:r>
-        <w:t xml:space="preserve"> is stored as double to support fractional hours (e.g., 1.5 hours).</w:t>
+      <w:r>
+        <w:t>HoursWorked is stored as double to support fractional hours (e.g., 1.5 hours).</w:t>
       </w:r>
     </w:p>
     <w:p>
@@ -4481,21 +3873,8 @@
         </w:numPr>
         <w:spacing w:after="80"/>
       </w:pPr>
-      <w:proofErr w:type="spellStart"/>
-      <w:r>
-        <w:t>HourlyRate</w:t>
-      </w:r>
-      <w:proofErr w:type="spellEnd"/>
-      <w:r>
-        <w:t xml:space="preserve"> on </w:t>
-      </w:r>
-      <w:proofErr w:type="spellStart"/>
-      <w:r>
-        <w:t>TimeEntry</w:t>
-      </w:r>
-      <w:proofErr w:type="spellEnd"/>
-      <w:r>
-        <w:t xml:space="preserve"> may differ from the parent Project rate to support per-entry overrides.</w:t>
+      <w:r>
+        <w:t>HourlyRate on TimeEntry may differ from the parent Project rate to support per-entry overrides.</w:t>
       </w:r>
     </w:p>
     <w:p/>
@@ -4743,7 +4122,6 @@
             </w:tcMar>
           </w:tcPr>
           <w:p>
-            <w:proofErr w:type="spellStart"/>
             <w:r>
               <w:rPr>
                 <w:b/>
@@ -4753,7 +4131,6 @@
               </w:rPr>
               <w:t>TimeEntries</w:t>
             </w:r>
-            <w:proofErr w:type="spellEnd"/>
           </w:p>
         </w:tc>
         <w:tc>
@@ -4779,23 +4156,7 @@
                 <w:sz w:val="20"/>
                 <w:szCs w:val="20"/>
               </w:rPr>
-              <w:t>List&lt;</w:t>
-            </w:r>
-            <w:proofErr w:type="spellStart"/>
-            <w:r>
-              <w:rPr>
-                <w:sz w:val="20"/>
-                <w:szCs w:val="20"/>
-              </w:rPr>
-              <w:t>TimeEntry</w:t>
-            </w:r>
-            <w:proofErr w:type="spellEnd"/>
-            <w:r>
-              <w:rPr>
-                <w:sz w:val="20"/>
-                <w:szCs w:val="20"/>
-              </w:rPr>
-              <w:t>&gt; — public</w:t>
+              <w:t>List&lt;TimeEntry&gt; — public</w:t>
             </w:r>
           </w:p>
         </w:tc>
@@ -4920,7 +4281,6 @@
               </w:rPr>
               <w:t xml:space="preserve">string </w:t>
             </w:r>
-            <w:proofErr w:type="spellStart"/>
             <w:proofErr w:type="gramStart"/>
             <w:r>
               <w:rPr>
@@ -4928,16 +4288,7 @@
                 <w:sz w:val="20"/>
                 <w:szCs w:val="20"/>
               </w:rPr>
-              <w:t>GenerateInvoiceSummary</w:t>
-            </w:r>
-            <w:proofErr w:type="spellEnd"/>
-            <w:r>
-              <w:rPr>
-                <w:rFonts w:ascii="Courier New" w:eastAsia="Courier New" w:hAnsi="Courier New" w:cs="Courier New"/>
-                <w:sz w:val="20"/>
-                <w:szCs w:val="20"/>
-              </w:rPr>
-              <w:t>(</w:t>
+              <w:t>GenerateInvoiceSummary(</w:t>
             </w:r>
             <w:proofErr w:type="gramEnd"/>
             <w:r>
@@ -5005,7 +4356,6 @@
               </w:rPr>
               <w:t xml:space="preserve">decimal </w:t>
             </w:r>
-            <w:proofErr w:type="spellStart"/>
             <w:proofErr w:type="gramStart"/>
             <w:r>
               <w:rPr>
@@ -5013,16 +4363,7 @@
                 <w:sz w:val="20"/>
                 <w:szCs w:val="20"/>
               </w:rPr>
-              <w:t>CalculateInvoiceTotal</w:t>
-            </w:r>
-            <w:proofErr w:type="spellEnd"/>
-            <w:r>
-              <w:rPr>
-                <w:rFonts w:ascii="Courier New" w:eastAsia="Courier New" w:hAnsi="Courier New" w:cs="Courier New"/>
-                <w:sz w:val="20"/>
-                <w:szCs w:val="20"/>
-              </w:rPr>
-              <w:t>(</w:t>
+              <w:t>CalculateInvoiceTotal(</w:t>
             </w:r>
             <w:proofErr w:type="gramEnd"/>
             <w:r>
@@ -5058,40 +4399,15 @@
                 <w:sz w:val="20"/>
                 <w:szCs w:val="20"/>
               </w:rPr>
-              <w:t xml:space="preserve">Iterates </w:t>
-            </w:r>
-            <w:proofErr w:type="spellStart"/>
-            <w:r>
-              <w:rPr>
-                <w:sz w:val="20"/>
-                <w:szCs w:val="20"/>
-              </w:rPr>
-              <w:t>TimeEntries</w:t>
-            </w:r>
-            <w:proofErr w:type="spellEnd"/>
-            <w:r>
-              <w:rPr>
-                <w:sz w:val="20"/>
-                <w:szCs w:val="20"/>
-              </w:rPr>
-              <w:t xml:space="preserve">, calls </w:t>
-            </w:r>
-            <w:proofErr w:type="spellStart"/>
+              <w:t xml:space="preserve">Iterates TimeEntries, calls </w:t>
+            </w:r>
             <w:proofErr w:type="gramStart"/>
             <w:r>
               <w:rPr>
                 <w:sz w:val="20"/>
                 <w:szCs w:val="20"/>
               </w:rPr>
-              <w:t>CalculateTotal</w:t>
-            </w:r>
-            <w:proofErr w:type="spellEnd"/>
-            <w:r>
-              <w:rPr>
-                <w:sz w:val="20"/>
-                <w:szCs w:val="20"/>
-              </w:rPr>
-              <w:t>(</w:t>
+              <w:t>CalculateTotal(</w:t>
             </w:r>
             <w:proofErr w:type="gramEnd"/>
             <w:r>
@@ -5131,7 +4447,6 @@
               </w:rPr>
               <w:t xml:space="preserve">override string </w:t>
             </w:r>
-            <w:proofErr w:type="spellStart"/>
             <w:proofErr w:type="gramStart"/>
             <w:r>
               <w:rPr>
@@ -5139,16 +4454,7 @@
                 <w:sz w:val="20"/>
                 <w:szCs w:val="20"/>
               </w:rPr>
-              <w:t>ToString</w:t>
-            </w:r>
-            <w:proofErr w:type="spellEnd"/>
-            <w:r>
-              <w:rPr>
-                <w:rFonts w:ascii="Courier New" w:eastAsia="Courier New" w:hAnsi="Courier New" w:cs="Courier New"/>
-                <w:sz w:val="20"/>
-                <w:szCs w:val="20"/>
-              </w:rPr>
-              <w:t>(</w:t>
+              <w:t>ToString(</w:t>
             </w:r>
             <w:proofErr w:type="gramEnd"/>
             <w:r>
@@ -5186,22 +4492,13 @@
               </w:rPr>
               <w:t xml:space="preserve">Calls </w:t>
             </w:r>
-            <w:proofErr w:type="spellStart"/>
             <w:proofErr w:type="gramStart"/>
             <w:r>
               <w:rPr>
                 <w:sz w:val="20"/>
                 <w:szCs w:val="20"/>
               </w:rPr>
-              <w:t>GenerateInvoiceSummary</w:t>
-            </w:r>
-            <w:proofErr w:type="spellEnd"/>
-            <w:r>
-              <w:rPr>
-                <w:sz w:val="20"/>
-                <w:szCs w:val="20"/>
-              </w:rPr>
-              <w:t>(</w:t>
+              <w:t>GenerateInvoiceSummary(</w:t>
             </w:r>
             <w:proofErr w:type="gramEnd"/>
             <w:r>
@@ -5369,23 +4666,7 @@
                 <w:sz w:val="20"/>
                 <w:szCs w:val="20"/>
               </w:rPr>
-              <w:t xml:space="preserve">Initializes with an empty </w:t>
-            </w:r>
-            <w:proofErr w:type="spellStart"/>
-            <w:r>
-              <w:rPr>
-                <w:sz w:val="20"/>
-                <w:szCs w:val="20"/>
-              </w:rPr>
-              <w:t>TimeEntries</w:t>
-            </w:r>
-            <w:proofErr w:type="spellEnd"/>
-            <w:r>
-              <w:rPr>
-                <w:sz w:val="20"/>
-                <w:szCs w:val="20"/>
-              </w:rPr>
-              <w:t xml:space="preserve"> list.</w:t>
+              <w:t>Initializes with an empty TimeEntries list.</w:t>
             </w:r>
           </w:p>
         </w:tc>
@@ -5425,25 +4706,7 @@
                 <w:sz w:val="20"/>
                 <w:szCs w:val="20"/>
               </w:rPr>
-              <w:t>Client, Project, List&lt;</w:t>
-            </w:r>
-            <w:proofErr w:type="spellStart"/>
-            <w:r>
-              <w:rPr>
-                <w:rFonts w:ascii="Courier New" w:eastAsia="Courier New" w:hAnsi="Courier New" w:cs="Courier New"/>
-                <w:sz w:val="20"/>
-                <w:szCs w:val="20"/>
-              </w:rPr>
-              <w:t>TimeEntry</w:t>
-            </w:r>
-            <w:proofErr w:type="spellEnd"/>
-            <w:r>
-              <w:rPr>
-                <w:rFonts w:ascii="Courier New" w:eastAsia="Courier New" w:hAnsi="Courier New" w:cs="Courier New"/>
-                <w:sz w:val="20"/>
-                <w:szCs w:val="20"/>
-              </w:rPr>
-              <w:t>&gt;)</w:t>
+              <w:t>Client, Project, List&lt;TimeEntry&gt;)</w:t>
             </w:r>
           </w:p>
         </w:tc>
@@ -5495,15 +4758,7 @@
         <w:spacing w:after="80"/>
       </w:pPr>
       <w:r>
-        <w:t>Demonstrates composition — Invoice contains Client, Project, and List&lt;</w:t>
-      </w:r>
-      <w:proofErr w:type="spellStart"/>
-      <w:r>
-        <w:t>TimeEntry</w:t>
-      </w:r>
-      <w:proofErr w:type="spellEnd"/>
-      <w:r>
-        <w:t>&gt; as member objects.</w:t>
+        <w:t>Demonstrates composition — Invoice contains Client, Project, and List&lt;TimeEntry&gt; as member objects.</w:t>
       </w:r>
     </w:p>
     <w:p>
@@ -5516,15 +4771,7 @@
         <w:spacing w:after="80"/>
       </w:pPr>
       <w:r>
-        <w:t xml:space="preserve">Invoice does not inherit from </w:t>
-      </w:r>
-      <w:proofErr w:type="spellStart"/>
-      <w:r>
-        <w:t>BaseEntity</w:t>
-      </w:r>
-      <w:proofErr w:type="spellEnd"/>
-      <w:r>
-        <w:t xml:space="preserve"> because it is a generated view, not a persisted record.</w:t>
+        <w:t>Invoice does not inherit from BaseEntity because it is a generated view, not a persisted record.</w:t>
       </w:r>
     </w:p>
     <w:p>
@@ -5536,47 +4783,21 @@
         </w:numPr>
         <w:spacing w:after="80"/>
       </w:pPr>
-      <w:proofErr w:type="spellStart"/>
       <w:proofErr w:type="gramStart"/>
       <w:r>
-        <w:t>CalculateInvoiceTotal</w:t>
-      </w:r>
-      <w:proofErr w:type="spellEnd"/>
-      <w:r>
-        <w:t>(</w:t>
+        <w:t>CalculateInvoiceTotal(</w:t>
       </w:r>
       <w:proofErr w:type="gramEnd"/>
       <w:r>
-        <w:t xml:space="preserve">) leverages </w:t>
-      </w:r>
-      <w:proofErr w:type="spellStart"/>
-      <w:r>
-        <w:t>IBillable</w:t>
-      </w:r>
-      <w:proofErr w:type="spellEnd"/>
-      <w:r>
-        <w:t xml:space="preserve"> through polymorphism — it calls </w:t>
-      </w:r>
-      <w:proofErr w:type="spellStart"/>
+        <w:t xml:space="preserve">) leverages IBillable through polymorphism — it calls </w:t>
+      </w:r>
       <w:proofErr w:type="gramStart"/>
       <w:r>
-        <w:t>CalculateTotal</w:t>
-      </w:r>
-      <w:proofErr w:type="spellEnd"/>
-      <w:r>
-        <w:t>(</w:t>
+        <w:t>CalculateTotal(</w:t>
       </w:r>
       <w:proofErr w:type="gramEnd"/>
       <w:r>
-        <w:t xml:space="preserve">) on each </w:t>
-      </w:r>
-      <w:proofErr w:type="spellStart"/>
-      <w:r>
-        <w:t>TimeEntry</w:t>
-      </w:r>
-      <w:proofErr w:type="spellEnd"/>
-      <w:r>
-        <w:t xml:space="preserve"> without knowing the specific implementation.</w:t>
+        <w:t>) on each TimeEntry without knowing the specific implementation.</w:t>
       </w:r>
     </w:p>
     <w:p/>
@@ -5585,15 +4806,7 @@
         <w:pStyle w:val="Heading2"/>
       </w:pPr>
       <w:r>
-        <w:t xml:space="preserve">2.9 </w:t>
-      </w:r>
-      <w:proofErr w:type="spellStart"/>
-      <w:r>
-        <w:t>DatabaseManager</w:t>
-      </w:r>
-      <w:proofErr w:type="spellEnd"/>
-      <w:r>
-        <w:t xml:space="preserve"> Class (Static Utility)</w:t>
+        <w:t>2.9 DatabaseManager Class (Static Utility)</w:t>
       </w:r>
     </w:p>
     <w:p>
@@ -5723,7 +4936,6 @@
               </w:rPr>
               <w:t xml:space="preserve">static void </w:t>
             </w:r>
-            <w:proofErr w:type="spellStart"/>
             <w:proofErr w:type="gramStart"/>
             <w:r>
               <w:rPr>
@@ -5731,16 +4943,7 @@
                 <w:sz w:val="20"/>
                 <w:szCs w:val="20"/>
               </w:rPr>
-              <w:t>InitializeDatabase</w:t>
-            </w:r>
-            <w:proofErr w:type="spellEnd"/>
-            <w:r>
-              <w:rPr>
-                <w:rFonts w:ascii="Courier New" w:eastAsia="Courier New" w:hAnsi="Courier New" w:cs="Courier New"/>
-                <w:sz w:val="20"/>
-                <w:szCs w:val="20"/>
-              </w:rPr>
-              <w:t>(</w:t>
+              <w:t>InitializeDatabase(</w:t>
             </w:r>
             <w:proofErr w:type="gramEnd"/>
             <w:r>
@@ -5809,7 +5012,6 @@
               <w:lastRenderedPageBreak/>
               <w:t xml:space="preserve">static void </w:t>
             </w:r>
-            <w:proofErr w:type="spellStart"/>
             <w:proofErr w:type="gramStart"/>
             <w:r>
               <w:rPr>
@@ -5817,16 +5019,7 @@
                 <w:sz w:val="20"/>
                 <w:szCs w:val="20"/>
               </w:rPr>
-              <w:t>CreateClient</w:t>
-            </w:r>
-            <w:proofErr w:type="spellEnd"/>
-            <w:r>
-              <w:rPr>
-                <w:rFonts w:ascii="Courier New" w:eastAsia="Courier New" w:hAnsi="Courier New" w:cs="Courier New"/>
-                <w:sz w:val="20"/>
-                <w:szCs w:val="20"/>
-              </w:rPr>
-              <w:t>(</w:t>
+              <w:t>CreateClient(</w:t>
             </w:r>
             <w:proofErr w:type="gramEnd"/>
             <w:r>
@@ -5894,7 +5087,6 @@
               </w:rPr>
               <w:t xml:space="preserve">static List&lt;Client&gt; </w:t>
             </w:r>
-            <w:proofErr w:type="spellStart"/>
             <w:proofErr w:type="gramStart"/>
             <w:r>
               <w:rPr>
@@ -5902,16 +5094,7 @@
                 <w:sz w:val="20"/>
                 <w:szCs w:val="20"/>
               </w:rPr>
-              <w:t>GetClients</w:t>
-            </w:r>
-            <w:proofErr w:type="spellEnd"/>
-            <w:r>
-              <w:rPr>
-                <w:rFonts w:ascii="Courier New" w:eastAsia="Courier New" w:hAnsi="Courier New" w:cs="Courier New"/>
-                <w:sz w:val="20"/>
-                <w:szCs w:val="20"/>
-              </w:rPr>
-              <w:t>(</w:t>
+              <w:t>GetClients(</w:t>
             </w:r>
             <w:proofErr w:type="gramEnd"/>
             <w:r>
@@ -5979,7 +5162,6 @@
               </w:rPr>
               <w:t xml:space="preserve">static Client </w:t>
             </w:r>
-            <w:proofErr w:type="spellStart"/>
             <w:proofErr w:type="gramStart"/>
             <w:r>
               <w:rPr>
@@ -5987,16 +5169,7 @@
                 <w:sz w:val="20"/>
                 <w:szCs w:val="20"/>
               </w:rPr>
-              <w:t>GetClientById</w:t>
-            </w:r>
-            <w:proofErr w:type="spellEnd"/>
-            <w:r>
-              <w:rPr>
-                <w:rFonts w:ascii="Courier New" w:eastAsia="Courier New" w:hAnsi="Courier New" w:cs="Courier New"/>
-                <w:sz w:val="20"/>
-                <w:szCs w:val="20"/>
-              </w:rPr>
-              <w:t>(</w:t>
+              <w:t>GetClientById(</w:t>
             </w:r>
             <w:proofErr w:type="gramEnd"/>
             <w:r>
@@ -6064,7 +5237,6 @@
               </w:rPr>
               <w:t xml:space="preserve">static void </w:t>
             </w:r>
-            <w:proofErr w:type="spellStart"/>
             <w:proofErr w:type="gramStart"/>
             <w:r>
               <w:rPr>
@@ -6072,16 +5244,7 @@
                 <w:sz w:val="20"/>
                 <w:szCs w:val="20"/>
               </w:rPr>
-              <w:t>UpdateClient</w:t>
-            </w:r>
-            <w:proofErr w:type="spellEnd"/>
-            <w:r>
-              <w:rPr>
-                <w:rFonts w:ascii="Courier New" w:eastAsia="Courier New" w:hAnsi="Courier New" w:cs="Courier New"/>
-                <w:sz w:val="20"/>
-                <w:szCs w:val="20"/>
-              </w:rPr>
-              <w:t>(</w:t>
+              <w:t>UpdateClient(</w:t>
             </w:r>
             <w:proofErr w:type="gramEnd"/>
             <w:r>
@@ -6117,23 +5280,7 @@
                 <w:sz w:val="20"/>
                 <w:szCs w:val="20"/>
               </w:rPr>
-              <w:t xml:space="preserve">Updates Name, Email, </w:t>
-            </w:r>
-            <w:proofErr w:type="spellStart"/>
-            <w:r>
-              <w:rPr>
-                <w:sz w:val="20"/>
-                <w:szCs w:val="20"/>
-              </w:rPr>
-              <w:t>PhoneNumber</w:t>
-            </w:r>
-            <w:proofErr w:type="spellEnd"/>
-            <w:r>
-              <w:rPr>
-                <w:sz w:val="20"/>
-                <w:szCs w:val="20"/>
-              </w:rPr>
-              <w:t>.</w:t>
+              <w:t>Updates Name, Email, PhoneNumber.</w:t>
             </w:r>
           </w:p>
         </w:tc>
@@ -6165,7 +5312,6 @@
               </w:rPr>
               <w:t xml:space="preserve">static void </w:t>
             </w:r>
-            <w:proofErr w:type="spellStart"/>
             <w:proofErr w:type="gramStart"/>
             <w:r>
               <w:rPr>
@@ -6173,16 +5319,7 @@
                 <w:sz w:val="20"/>
                 <w:szCs w:val="20"/>
               </w:rPr>
-              <w:t>DeleteClient</w:t>
-            </w:r>
-            <w:proofErr w:type="spellEnd"/>
-            <w:r>
-              <w:rPr>
-                <w:rFonts w:ascii="Courier New" w:eastAsia="Courier New" w:hAnsi="Courier New" w:cs="Courier New"/>
-                <w:sz w:val="20"/>
-                <w:szCs w:val="20"/>
-              </w:rPr>
-              <w:t>(</w:t>
+              <w:t>DeleteClient(</w:t>
             </w:r>
             <w:proofErr w:type="gramEnd"/>
             <w:r>
@@ -6250,7 +5387,6 @@
               </w:rPr>
               <w:t xml:space="preserve">static void </w:t>
             </w:r>
-            <w:proofErr w:type="spellStart"/>
             <w:proofErr w:type="gramStart"/>
             <w:r>
               <w:rPr>
@@ -6258,16 +5394,7 @@
                 <w:sz w:val="20"/>
                 <w:szCs w:val="20"/>
               </w:rPr>
-              <w:t>CreateProject</w:t>
-            </w:r>
-            <w:proofErr w:type="spellEnd"/>
-            <w:r>
-              <w:rPr>
-                <w:rFonts w:ascii="Courier New" w:eastAsia="Courier New" w:hAnsi="Courier New" w:cs="Courier New"/>
-                <w:sz w:val="20"/>
-                <w:szCs w:val="20"/>
-              </w:rPr>
-              <w:t>(</w:t>
+              <w:t>CreateProject(</w:t>
             </w:r>
             <w:proofErr w:type="gramEnd"/>
             <w:r>
@@ -6335,7 +5462,6 @@
               </w:rPr>
               <w:t xml:space="preserve">static List&lt;Project&gt; </w:t>
             </w:r>
-            <w:proofErr w:type="spellStart"/>
             <w:proofErr w:type="gramStart"/>
             <w:r>
               <w:rPr>
@@ -6343,16 +5469,7 @@
                 <w:sz w:val="20"/>
                 <w:szCs w:val="20"/>
               </w:rPr>
-              <w:t>GetProjects</w:t>
-            </w:r>
-            <w:proofErr w:type="spellEnd"/>
-            <w:r>
-              <w:rPr>
-                <w:rFonts w:ascii="Courier New" w:eastAsia="Courier New" w:hAnsi="Courier New" w:cs="Courier New"/>
-                <w:sz w:val="20"/>
-                <w:szCs w:val="20"/>
-              </w:rPr>
-              <w:t>(</w:t>
+              <w:t>GetProjects(</w:t>
             </w:r>
             <w:proofErr w:type="gramEnd"/>
             <w:r>
@@ -6420,7 +5537,6 @@
               </w:rPr>
               <w:t xml:space="preserve">static List&lt;Project&gt; </w:t>
             </w:r>
-            <w:proofErr w:type="spellStart"/>
             <w:proofErr w:type="gramStart"/>
             <w:r>
               <w:rPr>
@@ -6428,16 +5544,7 @@
                 <w:sz w:val="20"/>
                 <w:szCs w:val="20"/>
               </w:rPr>
-              <w:t>GetProjectsByClient</w:t>
-            </w:r>
-            <w:proofErr w:type="spellEnd"/>
-            <w:r>
-              <w:rPr>
-                <w:rFonts w:ascii="Courier New" w:eastAsia="Courier New" w:hAnsi="Courier New" w:cs="Courier New"/>
-                <w:sz w:val="20"/>
-                <w:szCs w:val="20"/>
-              </w:rPr>
-              <w:t>(</w:t>
+              <w:t>GetProjectsByClient(</w:t>
             </w:r>
             <w:proofErr w:type="gramEnd"/>
             <w:r>
@@ -6446,25 +5553,7 @@
                 <w:sz w:val="20"/>
                 <w:szCs w:val="20"/>
               </w:rPr>
-              <w:t xml:space="preserve">int </w:t>
-            </w:r>
-            <w:proofErr w:type="spellStart"/>
-            <w:r>
-              <w:rPr>
-                <w:rFonts w:ascii="Courier New" w:eastAsia="Courier New" w:hAnsi="Courier New" w:cs="Courier New"/>
-                <w:sz w:val="20"/>
-                <w:szCs w:val="20"/>
-              </w:rPr>
-              <w:t>clientId</w:t>
-            </w:r>
-            <w:proofErr w:type="spellEnd"/>
-            <w:r>
-              <w:rPr>
-                <w:rFonts w:ascii="Courier New" w:eastAsia="Courier New" w:hAnsi="Courier New" w:cs="Courier New"/>
-                <w:sz w:val="20"/>
-                <w:szCs w:val="20"/>
-              </w:rPr>
-              <w:t>)</w:t>
+              <w:t>int clientId)</w:t>
             </w:r>
           </w:p>
         </w:tc>
@@ -6491,23 +5580,7 @@
                 <w:sz w:val="20"/>
                 <w:szCs w:val="20"/>
               </w:rPr>
-              <w:t xml:space="preserve">Returns all Projects for a given </w:t>
-            </w:r>
-            <w:proofErr w:type="spellStart"/>
-            <w:r>
-              <w:rPr>
-                <w:sz w:val="20"/>
-                <w:szCs w:val="20"/>
-              </w:rPr>
-              <w:t>ClientId</w:t>
-            </w:r>
-            <w:proofErr w:type="spellEnd"/>
-            <w:r>
-              <w:rPr>
-                <w:sz w:val="20"/>
-                <w:szCs w:val="20"/>
-              </w:rPr>
-              <w:t>.</w:t>
+              <w:t>Returns all Projects for a given ClientId.</w:t>
             </w:r>
           </w:p>
         </w:tc>
@@ -6539,7 +5612,6 @@
               </w:rPr>
               <w:t xml:space="preserve">static void </w:t>
             </w:r>
-            <w:proofErr w:type="spellStart"/>
             <w:proofErr w:type="gramStart"/>
             <w:r>
               <w:rPr>
@@ -6547,16 +5619,7 @@
                 <w:sz w:val="20"/>
                 <w:szCs w:val="20"/>
               </w:rPr>
-              <w:t>UpdateProject</w:t>
-            </w:r>
-            <w:proofErr w:type="spellEnd"/>
-            <w:r>
-              <w:rPr>
-                <w:rFonts w:ascii="Courier New" w:eastAsia="Courier New" w:hAnsi="Courier New" w:cs="Courier New"/>
-                <w:sz w:val="20"/>
-                <w:szCs w:val="20"/>
-              </w:rPr>
-              <w:t>(</w:t>
+              <w:t>UpdateProject(</w:t>
             </w:r>
             <w:proofErr w:type="gramEnd"/>
             <w:r>
@@ -6624,7 +5687,6 @@
               </w:rPr>
               <w:t xml:space="preserve">static void </w:t>
             </w:r>
-            <w:proofErr w:type="spellStart"/>
             <w:proofErr w:type="gramStart"/>
             <w:r>
               <w:rPr>
@@ -6632,16 +5694,7 @@
                 <w:sz w:val="20"/>
                 <w:szCs w:val="20"/>
               </w:rPr>
-              <w:t>DeleteProject</w:t>
-            </w:r>
-            <w:proofErr w:type="spellEnd"/>
-            <w:r>
-              <w:rPr>
-                <w:rFonts w:ascii="Courier New" w:eastAsia="Courier New" w:hAnsi="Courier New" w:cs="Courier New"/>
-                <w:sz w:val="20"/>
-                <w:szCs w:val="20"/>
-              </w:rPr>
-              <w:t>(</w:t>
+              <w:t>DeleteProject(</w:t>
             </w:r>
             <w:proofErr w:type="gramEnd"/>
             <w:r>
@@ -6677,23 +5730,7 @@
                 <w:sz w:val="20"/>
                 <w:szCs w:val="20"/>
               </w:rPr>
-              <w:t xml:space="preserve">Deletes Project; cascades to Tasks and </w:t>
-            </w:r>
-            <w:proofErr w:type="spellStart"/>
-            <w:r>
-              <w:rPr>
-                <w:sz w:val="20"/>
-                <w:szCs w:val="20"/>
-              </w:rPr>
-              <w:t>TimeEntries</w:t>
-            </w:r>
-            <w:proofErr w:type="spellEnd"/>
-            <w:r>
-              <w:rPr>
-                <w:sz w:val="20"/>
-                <w:szCs w:val="20"/>
-              </w:rPr>
-              <w:t>.</w:t>
+              <w:t>Deletes Project; cascades to Tasks and TimeEntries.</w:t>
             </w:r>
           </w:p>
         </w:tc>
@@ -6725,7 +5762,6 @@
               </w:rPr>
               <w:t xml:space="preserve">static void </w:t>
             </w:r>
-            <w:proofErr w:type="spellStart"/>
             <w:proofErr w:type="gramStart"/>
             <w:r>
               <w:rPr>
@@ -6733,18 +5769,8 @@
                 <w:sz w:val="20"/>
                 <w:szCs w:val="20"/>
               </w:rPr>
-              <w:t>CreateTask</w:t>
-            </w:r>
-            <w:proofErr w:type="spellEnd"/>
-            <w:r>
-              <w:rPr>
-                <w:rFonts w:ascii="Courier New" w:eastAsia="Courier New" w:hAnsi="Courier New" w:cs="Courier New"/>
-                <w:sz w:val="20"/>
-                <w:szCs w:val="20"/>
-              </w:rPr>
-              <w:t>(</w:t>
-            </w:r>
-            <w:proofErr w:type="spellStart"/>
+              <w:t>CreateTask(</w:t>
+            </w:r>
             <w:proofErr w:type="gramEnd"/>
             <w:r>
               <w:rPr>
@@ -6752,16 +5778,7 @@
                 <w:sz w:val="20"/>
                 <w:szCs w:val="20"/>
               </w:rPr>
-              <w:t>TaskItem</w:t>
-            </w:r>
-            <w:proofErr w:type="spellEnd"/>
-            <w:r>
-              <w:rPr>
-                <w:rFonts w:ascii="Courier New" w:eastAsia="Courier New" w:hAnsi="Courier New" w:cs="Courier New"/>
-                <w:sz w:val="20"/>
-                <w:szCs w:val="20"/>
-              </w:rPr>
-              <w:t xml:space="preserve"> t)</w:t>
+              <w:t>TaskItem t)</w:t>
             </w:r>
           </w:p>
         </w:tc>
@@ -6788,23 +5805,7 @@
                 <w:sz w:val="20"/>
                 <w:szCs w:val="20"/>
               </w:rPr>
-              <w:t xml:space="preserve">Inserts a new </w:t>
-            </w:r>
-            <w:proofErr w:type="spellStart"/>
-            <w:r>
-              <w:rPr>
-                <w:sz w:val="20"/>
-                <w:szCs w:val="20"/>
-              </w:rPr>
-              <w:t>TaskItem</w:t>
-            </w:r>
-            <w:proofErr w:type="spellEnd"/>
-            <w:r>
-              <w:rPr>
-                <w:sz w:val="20"/>
-                <w:szCs w:val="20"/>
-              </w:rPr>
-              <w:t xml:space="preserve"> record.</w:t>
+              <w:t>Inserts a new TaskItem record.</w:t>
             </w:r>
           </w:p>
         </w:tc>
@@ -6834,27 +5835,8 @@
                 <w:sz w:val="20"/>
                 <w:szCs w:val="20"/>
               </w:rPr>
-              <w:t>static List&lt;</w:t>
-            </w:r>
-            <w:proofErr w:type="spellStart"/>
-            <w:r>
-              <w:rPr>
-                <w:rFonts w:ascii="Courier New" w:eastAsia="Courier New" w:hAnsi="Courier New" w:cs="Courier New"/>
-                <w:sz w:val="20"/>
-                <w:szCs w:val="20"/>
-              </w:rPr>
-              <w:t>TaskItem</w:t>
-            </w:r>
-            <w:proofErr w:type="spellEnd"/>
-            <w:r>
-              <w:rPr>
-                <w:rFonts w:ascii="Courier New" w:eastAsia="Courier New" w:hAnsi="Courier New" w:cs="Courier New"/>
-                <w:sz w:val="20"/>
-                <w:szCs w:val="20"/>
-              </w:rPr>
-              <w:t xml:space="preserve">&gt; </w:t>
-            </w:r>
-            <w:proofErr w:type="spellStart"/>
+              <w:t xml:space="preserve">static List&lt;TaskItem&gt; </w:t>
+            </w:r>
             <w:proofErr w:type="gramStart"/>
             <w:r>
               <w:rPr>
@@ -6862,16 +5844,7 @@
                 <w:sz w:val="20"/>
                 <w:szCs w:val="20"/>
               </w:rPr>
-              <w:t>GetTasksByProject</w:t>
-            </w:r>
-            <w:proofErr w:type="spellEnd"/>
-            <w:r>
-              <w:rPr>
-                <w:rFonts w:ascii="Courier New" w:eastAsia="Courier New" w:hAnsi="Courier New" w:cs="Courier New"/>
-                <w:sz w:val="20"/>
-                <w:szCs w:val="20"/>
-              </w:rPr>
-              <w:t>(</w:t>
+              <w:t>GetTasksByProject(</w:t>
             </w:r>
             <w:proofErr w:type="gramEnd"/>
             <w:r>
@@ -6880,25 +5853,7 @@
                 <w:sz w:val="20"/>
                 <w:szCs w:val="20"/>
               </w:rPr>
-              <w:t xml:space="preserve">int </w:t>
-            </w:r>
-            <w:proofErr w:type="spellStart"/>
-            <w:r>
-              <w:rPr>
-                <w:rFonts w:ascii="Courier New" w:eastAsia="Courier New" w:hAnsi="Courier New" w:cs="Courier New"/>
-                <w:sz w:val="20"/>
-                <w:szCs w:val="20"/>
-              </w:rPr>
-              <w:t>projectId</w:t>
-            </w:r>
-            <w:proofErr w:type="spellEnd"/>
-            <w:r>
-              <w:rPr>
-                <w:rFonts w:ascii="Courier New" w:eastAsia="Courier New" w:hAnsi="Courier New" w:cs="Courier New"/>
-                <w:sz w:val="20"/>
-                <w:szCs w:val="20"/>
-              </w:rPr>
-              <w:t>)</w:t>
+              <w:t>int projectId)</w:t>
             </w:r>
           </w:p>
         </w:tc>
@@ -6925,23 +5880,7 @@
                 <w:sz w:val="20"/>
                 <w:szCs w:val="20"/>
               </w:rPr>
-              <w:t xml:space="preserve">Returns all Tasks for a given </w:t>
-            </w:r>
-            <w:proofErr w:type="spellStart"/>
-            <w:r>
-              <w:rPr>
-                <w:sz w:val="20"/>
-                <w:szCs w:val="20"/>
-              </w:rPr>
-              <w:t>ProjectId</w:t>
-            </w:r>
-            <w:proofErr w:type="spellEnd"/>
-            <w:r>
-              <w:rPr>
-                <w:sz w:val="20"/>
-                <w:szCs w:val="20"/>
-              </w:rPr>
-              <w:t>.</w:t>
+              <w:t>Returns all Tasks for a given ProjectId.</w:t>
             </w:r>
           </w:p>
         </w:tc>
@@ -6973,7 +5912,6 @@
               </w:rPr>
               <w:t xml:space="preserve">static void </w:t>
             </w:r>
-            <w:proofErr w:type="spellStart"/>
             <w:proofErr w:type="gramStart"/>
             <w:r>
               <w:rPr>
@@ -6981,18 +5919,8 @@
                 <w:sz w:val="20"/>
                 <w:szCs w:val="20"/>
               </w:rPr>
-              <w:t>UpdateTask</w:t>
-            </w:r>
-            <w:proofErr w:type="spellEnd"/>
-            <w:r>
-              <w:rPr>
-                <w:rFonts w:ascii="Courier New" w:eastAsia="Courier New" w:hAnsi="Courier New" w:cs="Courier New"/>
-                <w:sz w:val="20"/>
-                <w:szCs w:val="20"/>
-              </w:rPr>
-              <w:t>(</w:t>
-            </w:r>
-            <w:proofErr w:type="spellStart"/>
+              <w:t>UpdateTask(</w:t>
+            </w:r>
             <w:proofErr w:type="gramEnd"/>
             <w:r>
               <w:rPr>
@@ -7000,16 +5928,7 @@
                 <w:sz w:val="20"/>
                 <w:szCs w:val="20"/>
               </w:rPr>
-              <w:t>TaskItem</w:t>
-            </w:r>
-            <w:proofErr w:type="spellEnd"/>
-            <w:r>
-              <w:rPr>
-                <w:rFonts w:ascii="Courier New" w:eastAsia="Courier New" w:hAnsi="Courier New" w:cs="Courier New"/>
-                <w:sz w:val="20"/>
-                <w:szCs w:val="20"/>
-              </w:rPr>
-              <w:t xml:space="preserve"> t)</w:t>
+              <w:t>TaskItem t)</w:t>
             </w:r>
           </w:p>
         </w:tc>
@@ -7036,23 +5955,7 @@
                 <w:sz w:val="20"/>
                 <w:szCs w:val="20"/>
               </w:rPr>
-              <w:t xml:space="preserve">Updates task fields including </w:t>
-            </w:r>
-            <w:proofErr w:type="spellStart"/>
-            <w:r>
-              <w:rPr>
-                <w:sz w:val="20"/>
-                <w:szCs w:val="20"/>
-              </w:rPr>
-              <w:t>IsCompleted</w:t>
-            </w:r>
-            <w:proofErr w:type="spellEnd"/>
-            <w:r>
-              <w:rPr>
-                <w:sz w:val="20"/>
-                <w:szCs w:val="20"/>
-              </w:rPr>
-              <w:t>.</w:t>
+              <w:t>Updates task fields including IsCompleted.</w:t>
             </w:r>
           </w:p>
         </w:tc>
@@ -7127,23 +6030,7 @@
                 <w:sz w:val="20"/>
                 <w:szCs w:val="20"/>
               </w:rPr>
-              <w:t xml:space="preserve">Deletes a single </w:t>
-            </w:r>
-            <w:proofErr w:type="spellStart"/>
-            <w:r>
-              <w:rPr>
-                <w:sz w:val="20"/>
-                <w:szCs w:val="20"/>
-              </w:rPr>
-              <w:t>TaskItem</w:t>
-            </w:r>
-            <w:proofErr w:type="spellEnd"/>
-            <w:r>
-              <w:rPr>
-                <w:sz w:val="20"/>
-                <w:szCs w:val="20"/>
-              </w:rPr>
-              <w:t xml:space="preserve"> record.</w:t>
+              <w:t>Deletes a single TaskItem record.</w:t>
             </w:r>
           </w:p>
         </w:tc>
@@ -7175,7 +6062,6 @@
               </w:rPr>
               <w:t xml:space="preserve">static void </w:t>
             </w:r>
-            <w:proofErr w:type="spellStart"/>
             <w:proofErr w:type="gramStart"/>
             <w:r>
               <w:rPr>
@@ -7183,18 +6069,8 @@
                 <w:sz w:val="20"/>
                 <w:szCs w:val="20"/>
               </w:rPr>
-              <w:t>CreateTimeEntry</w:t>
-            </w:r>
-            <w:proofErr w:type="spellEnd"/>
-            <w:r>
-              <w:rPr>
-                <w:rFonts w:ascii="Courier New" w:eastAsia="Courier New" w:hAnsi="Courier New" w:cs="Courier New"/>
-                <w:sz w:val="20"/>
-                <w:szCs w:val="20"/>
-              </w:rPr>
-              <w:t>(</w:t>
-            </w:r>
-            <w:proofErr w:type="spellStart"/>
+              <w:t>CreateTimeEntry(</w:t>
+            </w:r>
             <w:proofErr w:type="gramEnd"/>
             <w:r>
               <w:rPr>
@@ -7202,34 +6078,7 @@
                 <w:sz w:val="20"/>
                 <w:szCs w:val="20"/>
               </w:rPr>
-              <w:t>TimeEntry</w:t>
-            </w:r>
-            <w:proofErr w:type="spellEnd"/>
-            <w:r>
-              <w:rPr>
-                <w:rFonts w:ascii="Courier New" w:eastAsia="Courier New" w:hAnsi="Courier New" w:cs="Courier New"/>
-                <w:sz w:val="20"/>
-                <w:szCs w:val="20"/>
-              </w:rPr>
-              <w:t xml:space="preserve"> </w:t>
-            </w:r>
-            <w:proofErr w:type="spellStart"/>
-            <w:r>
-              <w:rPr>
-                <w:rFonts w:ascii="Courier New" w:eastAsia="Courier New" w:hAnsi="Courier New" w:cs="Courier New"/>
-                <w:sz w:val="20"/>
-                <w:szCs w:val="20"/>
-              </w:rPr>
-              <w:t>te</w:t>
-            </w:r>
-            <w:proofErr w:type="spellEnd"/>
-            <w:r>
-              <w:rPr>
-                <w:rFonts w:ascii="Courier New" w:eastAsia="Courier New" w:hAnsi="Courier New" w:cs="Courier New"/>
-                <w:sz w:val="20"/>
-                <w:szCs w:val="20"/>
-              </w:rPr>
-              <w:t>)</w:t>
+              <w:t>TimeEntry te)</w:t>
             </w:r>
           </w:p>
         </w:tc>
@@ -7256,23 +6105,7 @@
                 <w:sz w:val="20"/>
                 <w:szCs w:val="20"/>
               </w:rPr>
-              <w:t xml:space="preserve">Inserts a new </w:t>
-            </w:r>
-            <w:proofErr w:type="spellStart"/>
-            <w:r>
-              <w:rPr>
-                <w:sz w:val="20"/>
-                <w:szCs w:val="20"/>
-              </w:rPr>
-              <w:t>TimeEntry</w:t>
-            </w:r>
-            <w:proofErr w:type="spellEnd"/>
-            <w:r>
-              <w:rPr>
-                <w:sz w:val="20"/>
-                <w:szCs w:val="20"/>
-              </w:rPr>
-              <w:t xml:space="preserve"> record.</w:t>
+              <w:t>Inserts a new TimeEntry record.</w:t>
             </w:r>
           </w:p>
         </w:tc>
@@ -7302,25 +6135,7 @@
                 <w:sz w:val="20"/>
                 <w:szCs w:val="20"/>
               </w:rPr>
-              <w:t>static List&lt;</w:t>
-            </w:r>
-            <w:proofErr w:type="spellStart"/>
-            <w:r>
-              <w:rPr>
-                <w:rFonts w:ascii="Courier New" w:eastAsia="Courier New" w:hAnsi="Courier New" w:cs="Courier New"/>
-                <w:sz w:val="20"/>
-                <w:szCs w:val="20"/>
-              </w:rPr>
-              <w:t>TimeEntry</w:t>
-            </w:r>
-            <w:proofErr w:type="spellEnd"/>
-            <w:r>
-              <w:rPr>
-                <w:rFonts w:ascii="Courier New" w:eastAsia="Courier New" w:hAnsi="Courier New" w:cs="Courier New"/>
-                <w:sz w:val="20"/>
-                <w:szCs w:val="20"/>
-              </w:rPr>
-              <w:t xml:space="preserve">&gt; </w:t>
+              <w:t xml:space="preserve">static List&lt;TimeEntry&gt; </w:t>
             </w:r>
             <w:proofErr w:type="gramStart"/>
             <w:r>
@@ -7338,25 +6153,7 @@
                 <w:sz w:val="20"/>
                 <w:szCs w:val="20"/>
               </w:rPr>
-              <w:t xml:space="preserve">int </w:t>
-            </w:r>
-            <w:proofErr w:type="spellStart"/>
-            <w:r>
-              <w:rPr>
-                <w:rFonts w:ascii="Courier New" w:eastAsia="Courier New" w:hAnsi="Courier New" w:cs="Courier New"/>
-                <w:sz w:val="20"/>
-                <w:szCs w:val="20"/>
-              </w:rPr>
-              <w:t>projectId</w:t>
-            </w:r>
-            <w:proofErr w:type="spellEnd"/>
-            <w:r>
-              <w:rPr>
-                <w:rFonts w:ascii="Courier New" w:eastAsia="Courier New" w:hAnsi="Courier New" w:cs="Courier New"/>
-                <w:sz w:val="20"/>
-                <w:szCs w:val="20"/>
-              </w:rPr>
-              <w:t>)</w:t>
+              <w:t>int projectId)</w:t>
             </w:r>
           </w:p>
         </w:tc>
@@ -7383,39 +6180,7 @@
                 <w:sz w:val="20"/>
                 <w:szCs w:val="20"/>
               </w:rPr>
-              <w:t xml:space="preserve">Returns all </w:t>
-            </w:r>
-            <w:proofErr w:type="spellStart"/>
-            <w:r>
-              <w:rPr>
-                <w:sz w:val="20"/>
-                <w:szCs w:val="20"/>
-              </w:rPr>
-              <w:t>TimeEntries</w:t>
-            </w:r>
-            <w:proofErr w:type="spellEnd"/>
-            <w:r>
-              <w:rPr>
-                <w:sz w:val="20"/>
-                <w:szCs w:val="20"/>
-              </w:rPr>
-              <w:t xml:space="preserve"> for a given </w:t>
-            </w:r>
-            <w:proofErr w:type="spellStart"/>
-            <w:r>
-              <w:rPr>
-                <w:sz w:val="20"/>
-                <w:szCs w:val="20"/>
-              </w:rPr>
-              <w:t>ProjectId</w:t>
-            </w:r>
-            <w:proofErr w:type="spellEnd"/>
-            <w:r>
-              <w:rPr>
-                <w:sz w:val="20"/>
-                <w:szCs w:val="20"/>
-              </w:rPr>
-              <w:t>.</w:t>
+              <w:t>Returns all TimeEntries for a given ProjectId.</w:t>
             </w:r>
           </w:p>
         </w:tc>
@@ -7447,7 +6212,6 @@
               </w:rPr>
               <w:t xml:space="preserve">static void </w:t>
             </w:r>
-            <w:proofErr w:type="spellStart"/>
             <w:proofErr w:type="gramStart"/>
             <w:r>
               <w:rPr>
@@ -7455,18 +6219,8 @@
                 <w:sz w:val="20"/>
                 <w:szCs w:val="20"/>
               </w:rPr>
-              <w:t>UpdateTimeEntry</w:t>
-            </w:r>
-            <w:proofErr w:type="spellEnd"/>
-            <w:r>
-              <w:rPr>
-                <w:rFonts w:ascii="Courier New" w:eastAsia="Courier New" w:hAnsi="Courier New" w:cs="Courier New"/>
-                <w:sz w:val="20"/>
-                <w:szCs w:val="20"/>
-              </w:rPr>
-              <w:t>(</w:t>
-            </w:r>
-            <w:proofErr w:type="spellStart"/>
+              <w:t>UpdateTimeEntry(</w:t>
+            </w:r>
             <w:proofErr w:type="gramEnd"/>
             <w:r>
               <w:rPr>
@@ -7474,34 +6228,7 @@
                 <w:sz w:val="20"/>
                 <w:szCs w:val="20"/>
               </w:rPr>
-              <w:t>TimeEntry</w:t>
-            </w:r>
-            <w:proofErr w:type="spellEnd"/>
-            <w:r>
-              <w:rPr>
-                <w:rFonts w:ascii="Courier New" w:eastAsia="Courier New" w:hAnsi="Courier New" w:cs="Courier New"/>
-                <w:sz w:val="20"/>
-                <w:szCs w:val="20"/>
-              </w:rPr>
-              <w:t xml:space="preserve"> </w:t>
-            </w:r>
-            <w:proofErr w:type="spellStart"/>
-            <w:r>
-              <w:rPr>
-                <w:rFonts w:ascii="Courier New" w:eastAsia="Courier New" w:hAnsi="Courier New" w:cs="Courier New"/>
-                <w:sz w:val="20"/>
-                <w:szCs w:val="20"/>
-              </w:rPr>
-              <w:t>te</w:t>
-            </w:r>
-            <w:proofErr w:type="spellEnd"/>
-            <w:r>
-              <w:rPr>
-                <w:rFonts w:ascii="Courier New" w:eastAsia="Courier New" w:hAnsi="Courier New" w:cs="Courier New"/>
-                <w:sz w:val="20"/>
-                <w:szCs w:val="20"/>
-              </w:rPr>
-              <w:t>)</w:t>
+              <w:t>TimeEntry te)</w:t>
             </w:r>
           </w:p>
         </w:tc>
@@ -7560,7 +6287,6 @@
               </w:rPr>
               <w:t xml:space="preserve">static void </w:t>
             </w:r>
-            <w:proofErr w:type="spellStart"/>
             <w:proofErr w:type="gramStart"/>
             <w:r>
               <w:rPr>
@@ -7568,16 +6294,7 @@
                 <w:sz w:val="20"/>
                 <w:szCs w:val="20"/>
               </w:rPr>
-              <w:t>DeleteTimeEntry</w:t>
-            </w:r>
-            <w:proofErr w:type="spellEnd"/>
-            <w:r>
-              <w:rPr>
-                <w:rFonts w:ascii="Courier New" w:eastAsia="Courier New" w:hAnsi="Courier New" w:cs="Courier New"/>
-                <w:sz w:val="20"/>
-                <w:szCs w:val="20"/>
-              </w:rPr>
-              <w:t>(</w:t>
+              <w:t>DeleteTimeEntry(</w:t>
             </w:r>
             <w:proofErr w:type="gramEnd"/>
             <w:r>
@@ -7613,23 +6330,7 @@
                 <w:sz w:val="20"/>
                 <w:szCs w:val="20"/>
               </w:rPr>
-              <w:t xml:space="preserve">Deletes a single </w:t>
-            </w:r>
-            <w:proofErr w:type="spellStart"/>
-            <w:r>
-              <w:rPr>
-                <w:sz w:val="20"/>
-                <w:szCs w:val="20"/>
-              </w:rPr>
-              <w:t>TimeEntry</w:t>
-            </w:r>
-            <w:proofErr w:type="spellEnd"/>
-            <w:r>
-              <w:rPr>
-                <w:sz w:val="20"/>
-                <w:szCs w:val="20"/>
-              </w:rPr>
-              <w:t xml:space="preserve"> record.</w:t>
+              <w:t>Deletes a single TimeEntry record.</w:t>
             </w:r>
           </w:p>
         </w:tc>
@@ -7654,15 +6355,7 @@
         <w:spacing w:after="80"/>
       </w:pPr>
       <w:r>
-        <w:t xml:space="preserve">All methods are static — </w:t>
-      </w:r>
-      <w:proofErr w:type="spellStart"/>
-      <w:r>
-        <w:t>DatabaseManager</w:t>
-      </w:r>
-      <w:proofErr w:type="spellEnd"/>
-      <w:r>
-        <w:t xml:space="preserve"> is used as a utility class, not instantiated.</w:t>
+        <w:t>All methods are static — DatabaseManager is used as a utility class, not instantiated.</w:t>
       </w:r>
     </w:p>
     <w:p>
@@ -7677,12 +6370,10 @@
       <w:r>
         <w:t xml:space="preserve">Uses the </w:t>
       </w:r>
-      <w:proofErr w:type="spellStart"/>
       <w:proofErr w:type="gramStart"/>
       <w:r>
         <w:t>Microsoft.Data.Sqlite</w:t>
       </w:r>
-      <w:proofErr w:type="spellEnd"/>
       <w:proofErr w:type="gramEnd"/>
       <w:r>
         <w:t xml:space="preserve"> NuGet package for SQLite access in .NET.</w:t>
@@ -7729,23 +6420,7 @@
         <w:spacing w:after="120"/>
       </w:pPr>
       <w:r>
-        <w:t>The application uses a single SQLite database file (</w:t>
-      </w:r>
-      <w:proofErr w:type="spellStart"/>
-      <w:r>
-        <w:t>taskdesk.db</w:t>
-      </w:r>
-      <w:proofErr w:type="spellEnd"/>
-      <w:r>
-        <w:t xml:space="preserve">) located in the application’s working directory. SQLite was chosen because it requires no server setup, is fully embedded, and suits the single-user, terminal-based nature of this application. The database is initialized automatically on first launch by </w:t>
-      </w:r>
-      <w:proofErr w:type="spellStart"/>
-      <w:r>
-        <w:t>DatabaseManager.InitializeDatabase</w:t>
-      </w:r>
-      <w:proofErr w:type="spellEnd"/>
-      <w:r>
-        <w:t>().</w:t>
+        <w:t>The application uses a single SQLite database file (taskdesk.db) located in the application’s working directory. SQLite was chosen because it requires no server setup, is fully embedded, and suits the single-user, terminal-based nature of this application. The database is initialized automatically on first launch by DatabaseManager.InitializeDatabase().</w:t>
       </w:r>
     </w:p>
     <w:p/>
@@ -7859,7 +6534,6 @@
             </w:tcMar>
           </w:tcPr>
           <w:p>
-            <w:proofErr w:type="spellStart"/>
             <w:r>
               <w:rPr>
                 <w:b/>
@@ -7869,7 +6543,6 @@
               </w:rPr>
               <w:t>ClientId</w:t>
             </w:r>
-            <w:proofErr w:type="spellEnd"/>
           </w:p>
         </w:tc>
         <w:tc>
@@ -8035,7 +6708,6 @@
             </w:tcMar>
           </w:tcPr>
           <w:p>
-            <w:proofErr w:type="spellStart"/>
             <w:r>
               <w:rPr>
                 <w:b/>
@@ -8045,7 +6717,6 @@
               </w:rPr>
               <w:t>PhoneNumber</w:t>
             </w:r>
-            <w:proofErr w:type="spellEnd"/>
           </w:p>
         </w:tc>
         <w:tc>
@@ -8095,7 +6766,6 @@
             </w:tcMar>
           </w:tcPr>
           <w:p>
-            <w:proofErr w:type="spellStart"/>
             <w:r>
               <w:rPr>
                 <w:b/>
@@ -8105,7 +6775,6 @@
               </w:rPr>
               <w:t>CreatedAt</w:t>
             </w:r>
-            <w:proofErr w:type="spellEnd"/>
           </w:p>
         </w:tc>
         <w:tc>
@@ -8248,7 +6917,6 @@
             </w:tcMar>
           </w:tcPr>
           <w:p>
-            <w:proofErr w:type="spellStart"/>
             <w:r>
               <w:rPr>
                 <w:b/>
@@ -8258,7 +6926,6 @@
               </w:rPr>
               <w:t>ProjectId</w:t>
             </w:r>
-            <w:proofErr w:type="spellEnd"/>
           </w:p>
         </w:tc>
         <w:tc>
@@ -8308,7 +6975,6 @@
             </w:tcMar>
           </w:tcPr>
           <w:p>
-            <w:proofErr w:type="spellStart"/>
             <w:r>
               <w:rPr>
                 <w:b/>
@@ -8318,7 +6984,6 @@
               </w:rPr>
               <w:t>ClientId</w:t>
             </w:r>
-            <w:proofErr w:type="spellEnd"/>
           </w:p>
         </w:tc>
         <w:tc>
@@ -8354,22 +7019,13 @@
               </w:rPr>
               <w:t>Clients(</w:t>
             </w:r>
-            <w:proofErr w:type="spellStart"/>
             <w:proofErr w:type="gramEnd"/>
             <w:r>
               <w:rPr>
                 <w:sz w:val="20"/>
                 <w:szCs w:val="20"/>
               </w:rPr>
-              <w:t>ClientId</w:t>
-            </w:r>
-            <w:proofErr w:type="spellEnd"/>
-            <w:r>
-              <w:rPr>
-                <w:sz w:val="20"/>
-                <w:szCs w:val="20"/>
-              </w:rPr>
-              <w:t>) ON DELETE CASCADE</w:t>
+              <w:t>ClientId) ON DELETE CASCADE</w:t>
             </w:r>
           </w:p>
         </w:tc>
@@ -8393,7 +7049,6 @@
             </w:tcMar>
           </w:tcPr>
           <w:p>
-            <w:proofErr w:type="spellStart"/>
             <w:r>
               <w:rPr>
                 <w:b/>
@@ -8403,7 +7058,6 @@
               </w:rPr>
               <w:t>ProjectName</w:t>
             </w:r>
-            <w:proofErr w:type="spellEnd"/>
           </w:p>
         </w:tc>
         <w:tc>
@@ -8453,7 +7107,6 @@
             </w:tcMar>
           </w:tcPr>
           <w:p>
-            <w:proofErr w:type="spellStart"/>
             <w:r>
               <w:rPr>
                 <w:b/>
@@ -8463,7 +7116,6 @@
               </w:rPr>
               <w:t>HourlyRate</w:t>
             </w:r>
-            <w:proofErr w:type="spellEnd"/>
           </w:p>
         </w:tc>
         <w:tc>
@@ -8571,7 +7223,6 @@
             </w:tcMar>
           </w:tcPr>
           <w:p>
-            <w:proofErr w:type="spellStart"/>
             <w:r>
               <w:rPr>
                 <w:b/>
@@ -8581,7 +7232,6 @@
               </w:rPr>
               <w:t>CreatedAt</w:t>
             </w:r>
-            <w:proofErr w:type="spellEnd"/>
           </w:p>
         </w:tc>
         <w:tc>
@@ -8724,7 +7374,6 @@
             </w:tcMar>
           </w:tcPr>
           <w:p>
-            <w:proofErr w:type="spellStart"/>
             <w:r>
               <w:rPr>
                 <w:b/>
@@ -8734,7 +7383,6 @@
               </w:rPr>
               <w:t>TaskId</w:t>
             </w:r>
-            <w:proofErr w:type="spellEnd"/>
           </w:p>
         </w:tc>
         <w:tc>
@@ -8784,7 +7432,6 @@
             </w:tcMar>
           </w:tcPr>
           <w:p>
-            <w:proofErr w:type="spellStart"/>
             <w:r>
               <w:rPr>
                 <w:b/>
@@ -8794,7 +7441,6 @@
               </w:rPr>
               <w:t>ProjectId</w:t>
             </w:r>
-            <w:proofErr w:type="spellEnd"/>
           </w:p>
         </w:tc>
         <w:tc>
@@ -8830,22 +7476,13 @@
               </w:rPr>
               <w:t>Projects(</w:t>
             </w:r>
-            <w:proofErr w:type="spellStart"/>
             <w:proofErr w:type="gramEnd"/>
             <w:r>
               <w:rPr>
                 <w:sz w:val="20"/>
                 <w:szCs w:val="20"/>
               </w:rPr>
-              <w:t>ProjectId</w:t>
-            </w:r>
-            <w:proofErr w:type="spellEnd"/>
-            <w:r>
-              <w:rPr>
-                <w:sz w:val="20"/>
-                <w:szCs w:val="20"/>
-              </w:rPr>
-              <w:t>) ON DELETE CASCADE</w:t>
+              <w:t>ProjectId) ON DELETE CASCADE</w:t>
             </w:r>
           </w:p>
         </w:tc>
@@ -8986,7 +7623,6 @@
             </w:tcMar>
           </w:tcPr>
           <w:p>
-            <w:proofErr w:type="spellStart"/>
             <w:r>
               <w:rPr>
                 <w:b/>
@@ -8996,7 +7632,6 @@
               </w:rPr>
               <w:t>IsCompleted</w:t>
             </w:r>
-            <w:proofErr w:type="spellEnd"/>
           </w:p>
         </w:tc>
         <w:tc>
@@ -9046,7 +7681,6 @@
             </w:tcMar>
           </w:tcPr>
           <w:p>
-            <w:proofErr w:type="spellStart"/>
             <w:r>
               <w:rPr>
                 <w:b/>
@@ -9056,7 +7690,6 @@
               </w:rPr>
               <w:t>CreatedAt</w:t>
             </w:r>
-            <w:proofErr w:type="spellEnd"/>
           </w:p>
         </w:tc>
         <w:tc>
@@ -9094,13 +7727,8 @@
         <w:pStyle w:val="Heading2"/>
       </w:pPr>
       <w:r>
-        <w:t xml:space="preserve">3.4 Table: </w:t>
-      </w:r>
-      <w:proofErr w:type="spellStart"/>
-      <w:r>
-        <w:t>TimeEntries</w:t>
-      </w:r>
-      <w:proofErr w:type="spellEnd"/>
+        <w:t>3.4 Table: TimeEntries</w:t>
+      </w:r>
     </w:p>
     <w:tbl>
       <w:tblPr>
@@ -9204,7 +7832,6 @@
             </w:tcMar>
           </w:tcPr>
           <w:p>
-            <w:proofErr w:type="spellStart"/>
             <w:r>
               <w:rPr>
                 <w:b/>
@@ -9214,7 +7841,6 @@
               </w:rPr>
               <w:t>TimeEntryId</w:t>
             </w:r>
-            <w:proofErr w:type="spellEnd"/>
           </w:p>
         </w:tc>
         <w:tc>
@@ -9264,7 +7890,6 @@
             </w:tcMar>
           </w:tcPr>
           <w:p>
-            <w:proofErr w:type="spellStart"/>
             <w:r>
               <w:rPr>
                 <w:b/>
@@ -9274,7 +7899,6 @@
               </w:rPr>
               <w:t>ProjectId</w:t>
             </w:r>
-            <w:proofErr w:type="spellEnd"/>
           </w:p>
         </w:tc>
         <w:tc>
@@ -9310,22 +7934,13 @@
               </w:rPr>
               <w:t>Projects(</w:t>
             </w:r>
-            <w:proofErr w:type="spellStart"/>
             <w:proofErr w:type="gramEnd"/>
             <w:r>
               <w:rPr>
                 <w:sz w:val="20"/>
                 <w:szCs w:val="20"/>
               </w:rPr>
-              <w:t>ProjectId</w:t>
-            </w:r>
-            <w:proofErr w:type="spellEnd"/>
-            <w:r>
-              <w:rPr>
-                <w:sz w:val="20"/>
-                <w:szCs w:val="20"/>
-              </w:rPr>
-              <w:t>) ON DELETE CASCADE</w:t>
+              <w:t>ProjectId) ON DELETE CASCADE</w:t>
             </w:r>
           </w:p>
         </w:tc>
@@ -9349,7 +7964,6 @@
             </w:tcMar>
           </w:tcPr>
           <w:p>
-            <w:proofErr w:type="spellStart"/>
             <w:r>
               <w:rPr>
                 <w:b/>
@@ -9359,7 +7973,6 @@
               </w:rPr>
               <w:t>HoursWorked</w:t>
             </w:r>
-            <w:proofErr w:type="spellEnd"/>
           </w:p>
         </w:tc>
         <w:tc>
@@ -9409,7 +8022,6 @@
             </w:tcMar>
           </w:tcPr>
           <w:p>
-            <w:proofErr w:type="spellStart"/>
             <w:r>
               <w:rPr>
                 <w:b/>
@@ -9419,7 +8031,6 @@
               </w:rPr>
               <w:t>HourlyRate</w:t>
             </w:r>
-            <w:proofErr w:type="spellEnd"/>
           </w:p>
         </w:tc>
         <w:tc>
@@ -9469,7 +8080,6 @@
             </w:tcMar>
           </w:tcPr>
           <w:p>
-            <w:proofErr w:type="spellStart"/>
             <w:r>
               <w:rPr>
                 <w:b/>
@@ -9479,7 +8089,6 @@
               </w:rPr>
               <w:t>WorkDescription</w:t>
             </w:r>
-            <w:proofErr w:type="spellEnd"/>
           </w:p>
         </w:tc>
         <w:tc>
@@ -9529,7 +8138,6 @@
             </w:tcMar>
           </w:tcPr>
           <w:p>
-            <w:proofErr w:type="spellStart"/>
             <w:r>
               <w:rPr>
                 <w:b/>
@@ -9539,7 +8147,6 @@
               </w:rPr>
               <w:t>CreatedAt</w:t>
             </w:r>
-            <w:proofErr w:type="spellEnd"/>
           </w:p>
         </w:tc>
         <w:tc>
@@ -9837,9 +8444,73 @@
                 <w:sz w:val="20"/>
                 <w:szCs w:val="20"/>
               </w:rPr>
-              <w:t xml:space="preserve">Projects → </w:t>
-            </w:r>
-            <w:proofErr w:type="spellStart"/>
+              <w:t>Projects → TimeEntries</w:t>
+            </w:r>
+          </w:p>
+        </w:tc>
+        <w:tc>
+          <w:tcPr>
+            <w:tcW w:w="6560" w:type="dxa"/>
+            <w:tcBorders>
+              <w:top w:val="single" w:sz="1" w:space="0" w:color="CCCCCC"/>
+              <w:left w:val="single" w:sz="1" w:space="0" w:color="CCCCCC"/>
+              <w:bottom w:val="single" w:sz="1" w:space="0" w:color="CCCCCC"/>
+              <w:right w:val="single" w:sz="1" w:space="0" w:color="CCCCCC"/>
+            </w:tcBorders>
+            <w:shd w:val="clear" w:color="auto" w:fill="EEF4FB"/>
+            <w:tcMar>
+              <w:top w:w="80" w:type="dxa"/>
+              <w:left w:w="120" w:type="dxa"/>
+              <w:bottom w:w="80" w:type="dxa"/>
+              <w:right w:w="120" w:type="dxa"/>
+            </w:tcMar>
+          </w:tcPr>
+          <w:p>
+            <w:r>
+              <w:rPr>
+                <w:sz w:val="20"/>
+                <w:szCs w:val="20"/>
+              </w:rPr>
+              <w:t xml:space="preserve">One-to-many. Deleting a </w:t>
+            </w:r>
+            <w:proofErr w:type="gramStart"/>
+            <w:r>
+              <w:rPr>
+                <w:sz w:val="20"/>
+                <w:szCs w:val="20"/>
+              </w:rPr>
+              <w:t>project cascades</w:t>
+            </w:r>
+            <w:proofErr w:type="gramEnd"/>
+            <w:r>
+              <w:rPr>
+                <w:sz w:val="20"/>
+                <w:szCs w:val="20"/>
+              </w:rPr>
+              <w:t xml:space="preserve"> to all linked time entries.</w:t>
+            </w:r>
+          </w:p>
+        </w:tc>
+      </w:tr>
+      <w:tr>
+        <w:tc>
+          <w:tcPr>
+            <w:tcW w:w="2800" w:type="dxa"/>
+            <w:tcBorders>
+              <w:top w:val="single" w:sz="1" w:space="0" w:color="CCCCCC"/>
+              <w:left w:val="single" w:sz="1" w:space="0" w:color="CCCCCC"/>
+              <w:bottom w:val="single" w:sz="1" w:space="0" w:color="CCCCCC"/>
+              <w:right w:val="single" w:sz="1" w:space="0" w:color="CCCCCC"/>
+            </w:tcBorders>
+            <w:shd w:val="clear" w:color="auto" w:fill="FFFFFF"/>
+            <w:tcMar>
+              <w:top w:w="80" w:type="dxa"/>
+              <w:left w:w="120" w:type="dxa"/>
+              <w:bottom w:w="80" w:type="dxa"/>
+              <w:right w:w="120" w:type="dxa"/>
+            </w:tcMar>
+          </w:tcPr>
+          <w:p>
             <w:r>
               <w:rPr>
                 <w:b/>
@@ -9847,9 +8518,8 @@
                 <w:sz w:val="20"/>
                 <w:szCs w:val="20"/>
               </w:rPr>
-              <w:t>TimeEntries</w:t>
-            </w:r>
-            <w:proofErr w:type="spellEnd"/>
+              <w:t>Projects → Invoice (runtime)</w:t>
+            </w:r>
           </w:p>
         </w:tc>
         <w:tc>
@@ -9861,51 +8531,6 @@
               <w:bottom w:val="single" w:sz="1" w:space="0" w:color="CCCCCC"/>
               <w:right w:val="single" w:sz="1" w:space="0" w:color="CCCCCC"/>
             </w:tcBorders>
-            <w:shd w:val="clear" w:color="auto" w:fill="EEF4FB"/>
-            <w:tcMar>
-              <w:top w:w="80" w:type="dxa"/>
-              <w:left w:w="120" w:type="dxa"/>
-              <w:bottom w:w="80" w:type="dxa"/>
-              <w:right w:w="120" w:type="dxa"/>
-            </w:tcMar>
-          </w:tcPr>
-          <w:p>
-            <w:r>
-              <w:rPr>
-                <w:sz w:val="20"/>
-                <w:szCs w:val="20"/>
-              </w:rPr>
-              <w:t xml:space="preserve">One-to-many. Deleting a </w:t>
-            </w:r>
-            <w:proofErr w:type="gramStart"/>
-            <w:r>
-              <w:rPr>
-                <w:sz w:val="20"/>
-                <w:szCs w:val="20"/>
-              </w:rPr>
-              <w:t>project cascades</w:t>
-            </w:r>
-            <w:proofErr w:type="gramEnd"/>
-            <w:r>
-              <w:rPr>
-                <w:sz w:val="20"/>
-                <w:szCs w:val="20"/>
-              </w:rPr>
-              <w:t xml:space="preserve"> to all linked time entries.</w:t>
-            </w:r>
-          </w:p>
-        </w:tc>
-      </w:tr>
-      <w:tr>
-        <w:tc>
-          <w:tcPr>
-            <w:tcW w:w="2800" w:type="dxa"/>
-            <w:tcBorders>
-              <w:top w:val="single" w:sz="1" w:space="0" w:color="CCCCCC"/>
-              <w:left w:val="single" w:sz="1" w:space="0" w:color="CCCCCC"/>
-              <w:bottom w:val="single" w:sz="1" w:space="0" w:color="CCCCCC"/>
-              <w:right w:val="single" w:sz="1" w:space="0" w:color="CCCCCC"/>
-            </w:tcBorders>
             <w:shd w:val="clear" w:color="auto" w:fill="FFFFFF"/>
             <w:tcMar>
               <w:top w:w="80" w:type="dxa"/>
@@ -9917,55 +8542,10 @@
           <w:p>
             <w:r>
               <w:rPr>
-                <w:b/>
-                <w:bCs/>
-                <w:sz w:val="20"/>
-                <w:szCs w:val="20"/>
-              </w:rPr>
-              <w:t>Projects → Invoice (runtime)</w:t>
-            </w:r>
-          </w:p>
-        </w:tc>
-        <w:tc>
-          <w:tcPr>
-            <w:tcW w:w="6560" w:type="dxa"/>
-            <w:tcBorders>
-              <w:top w:val="single" w:sz="1" w:space="0" w:color="CCCCCC"/>
-              <w:left w:val="single" w:sz="1" w:space="0" w:color="CCCCCC"/>
-              <w:bottom w:val="single" w:sz="1" w:space="0" w:color="CCCCCC"/>
-              <w:right w:val="single" w:sz="1" w:space="0" w:color="CCCCCC"/>
-            </w:tcBorders>
-            <w:shd w:val="clear" w:color="auto" w:fill="FFFFFF"/>
-            <w:tcMar>
-              <w:top w:w="80" w:type="dxa"/>
-              <w:left w:w="120" w:type="dxa"/>
-              <w:bottom w:w="80" w:type="dxa"/>
-              <w:right w:w="120" w:type="dxa"/>
-            </w:tcMar>
-          </w:tcPr>
-          <w:p>
-            <w:r>
-              <w:rPr>
-                <w:sz w:val="20"/>
-                <w:szCs w:val="20"/>
-              </w:rPr>
-              <w:t xml:space="preserve">Runtime only. Invoice is composed at runtime by fetching the Project, its parent Client, and all associated </w:t>
-            </w:r>
-            <w:proofErr w:type="spellStart"/>
-            <w:r>
-              <w:rPr>
-                <w:sz w:val="20"/>
-                <w:szCs w:val="20"/>
-              </w:rPr>
-              <w:t>TimeEntries</w:t>
-            </w:r>
-            <w:proofErr w:type="spellEnd"/>
-            <w:r>
-              <w:rPr>
-                <w:sz w:val="20"/>
-                <w:szCs w:val="20"/>
-              </w:rPr>
-              <w:t>. Invoices are not stored as a table — they are generated on demand.</w:t>
+                <w:sz w:val="20"/>
+                <w:szCs w:val="20"/>
+              </w:rPr>
+              <w:t>Runtime only. Invoice is composed at runtime by fetching the Project, its parent Client, and all associated TimeEntries. Invoices are not stored as a table — they are generated on demand.</w:t>
             </w:r>
           </w:p>
         </w:tc>
@@ -10111,38 +8691,20 @@
             </w:tcMar>
           </w:tcPr>
           <w:p>
-            <w:proofErr w:type="spellStart"/>
-            <w:r>
-              <w:rPr>
-                <w:sz w:val="20"/>
-                <w:szCs w:val="20"/>
-              </w:rPr>
-              <w:t>BaseEntity</w:t>
-            </w:r>
-            <w:proofErr w:type="spellEnd"/>
-            <w:r>
-              <w:rPr>
-                <w:sz w:val="20"/>
-                <w:szCs w:val="20"/>
-              </w:rPr>
-              <w:t xml:space="preserve"> is an abstract class that cannot be instantiated directly. It defines shared state and enforces </w:t>
-            </w:r>
-            <w:proofErr w:type="spellStart"/>
+            <w:r>
+              <w:rPr>
+                <w:sz w:val="20"/>
+                <w:szCs w:val="20"/>
+              </w:rPr>
+              <w:t xml:space="preserve">BaseEntity is an abstract class that cannot be instantiated directly. It defines shared state and enforces </w:t>
+            </w:r>
             <w:proofErr w:type="gramStart"/>
             <w:r>
               <w:rPr>
                 <w:sz w:val="20"/>
                 <w:szCs w:val="20"/>
               </w:rPr>
-              <w:t>GetInfo</w:t>
-            </w:r>
-            <w:proofErr w:type="spellEnd"/>
-            <w:r>
-              <w:rPr>
-                <w:sz w:val="20"/>
-                <w:szCs w:val="20"/>
-              </w:rPr>
-              <w:t>(</w:t>
+              <w:t>GetInfo(</w:t>
             </w:r>
             <w:proofErr w:type="gramEnd"/>
             <w:r>
@@ -10208,71 +8770,7 @@
                 <w:sz w:val="20"/>
                 <w:szCs w:val="20"/>
               </w:rPr>
-              <w:t xml:space="preserve">Client, Project, </w:t>
-            </w:r>
-            <w:proofErr w:type="spellStart"/>
-            <w:r>
-              <w:rPr>
-                <w:sz w:val="20"/>
-                <w:szCs w:val="20"/>
-              </w:rPr>
-              <w:t>TaskItem</w:t>
-            </w:r>
-            <w:proofErr w:type="spellEnd"/>
-            <w:r>
-              <w:rPr>
-                <w:sz w:val="20"/>
-                <w:szCs w:val="20"/>
-              </w:rPr>
-              <w:t xml:space="preserve">, and </w:t>
-            </w:r>
-            <w:proofErr w:type="spellStart"/>
-            <w:r>
-              <w:rPr>
-                <w:sz w:val="20"/>
-                <w:szCs w:val="20"/>
-              </w:rPr>
-              <w:t>TimeEntry</w:t>
-            </w:r>
-            <w:proofErr w:type="spellEnd"/>
-            <w:r>
-              <w:rPr>
-                <w:sz w:val="20"/>
-                <w:szCs w:val="20"/>
-              </w:rPr>
-              <w:t xml:space="preserve"> all extend </w:t>
-            </w:r>
-            <w:proofErr w:type="spellStart"/>
-            <w:r>
-              <w:rPr>
-                <w:sz w:val="20"/>
-                <w:szCs w:val="20"/>
-              </w:rPr>
-              <w:t>BaseEntity</w:t>
-            </w:r>
-            <w:proofErr w:type="spellEnd"/>
-            <w:r>
-              <w:rPr>
-                <w:sz w:val="20"/>
-                <w:szCs w:val="20"/>
-              </w:rPr>
-              <w:t xml:space="preserve">, inheriting Id and </w:t>
-            </w:r>
-            <w:proofErr w:type="spellStart"/>
-            <w:r>
-              <w:rPr>
-                <w:sz w:val="20"/>
-                <w:szCs w:val="20"/>
-              </w:rPr>
-              <w:t>CreatedAt</w:t>
-            </w:r>
-            <w:proofErr w:type="spellEnd"/>
-            <w:r>
-              <w:rPr>
-                <w:sz w:val="20"/>
-                <w:szCs w:val="20"/>
-              </w:rPr>
-              <w:t>.</w:t>
+              <w:t>Client, Project, TaskItem, and TimeEntry all extend BaseEntity, inheriting Id and CreatedAt.</w:t>
             </w:r>
           </w:p>
         </w:tc>
@@ -10332,22 +8830,13 @@
               </w:rPr>
               <w:t xml:space="preserve">Each subclass overrides </w:t>
             </w:r>
-            <w:proofErr w:type="spellStart"/>
             <w:proofErr w:type="gramStart"/>
             <w:r>
               <w:rPr>
                 <w:sz w:val="20"/>
                 <w:szCs w:val="20"/>
               </w:rPr>
-              <w:t>GetInfo</w:t>
-            </w:r>
-            <w:proofErr w:type="spellEnd"/>
-            <w:r>
-              <w:rPr>
-                <w:sz w:val="20"/>
-                <w:szCs w:val="20"/>
-              </w:rPr>
-              <w:t>(</w:t>
+              <w:t>GetInfo(</w:t>
             </w:r>
             <w:proofErr w:type="gramEnd"/>
             <w:r>
@@ -10357,22 +8846,13 @@
               </w:rPr>
               <w:t xml:space="preserve">) to return class-specific formatted output. </w:t>
             </w:r>
-            <w:proofErr w:type="spellStart"/>
             <w:proofErr w:type="gramStart"/>
             <w:r>
               <w:rPr>
                 <w:sz w:val="20"/>
                 <w:szCs w:val="20"/>
               </w:rPr>
-              <w:t>ToString</w:t>
-            </w:r>
-            <w:proofErr w:type="spellEnd"/>
-            <w:r>
-              <w:rPr>
-                <w:sz w:val="20"/>
-                <w:szCs w:val="20"/>
-              </w:rPr>
-              <w:t>(</w:t>
+              <w:t>ToString(</w:t>
             </w:r>
             <w:proofErr w:type="gramEnd"/>
             <w:r>
@@ -10433,38 +8913,20 @@
             </w:tcMar>
           </w:tcPr>
           <w:p>
-            <w:proofErr w:type="spellStart"/>
-            <w:r>
-              <w:rPr>
-                <w:sz w:val="20"/>
-                <w:szCs w:val="20"/>
-              </w:rPr>
-              <w:t>IBillable</w:t>
-            </w:r>
-            <w:proofErr w:type="spellEnd"/>
-            <w:r>
-              <w:rPr>
-                <w:sz w:val="20"/>
-                <w:szCs w:val="20"/>
-              </w:rPr>
-              <w:t xml:space="preserve"> defines the </w:t>
-            </w:r>
-            <w:proofErr w:type="spellStart"/>
+            <w:r>
+              <w:rPr>
+                <w:sz w:val="20"/>
+                <w:szCs w:val="20"/>
+              </w:rPr>
+              <w:t xml:space="preserve">IBillable defines the </w:t>
+            </w:r>
             <w:proofErr w:type="gramStart"/>
             <w:r>
               <w:rPr>
                 <w:sz w:val="20"/>
                 <w:szCs w:val="20"/>
               </w:rPr>
-              <w:t>CalculateTotal</w:t>
-            </w:r>
-            <w:proofErr w:type="spellEnd"/>
-            <w:r>
-              <w:rPr>
-                <w:sz w:val="20"/>
-                <w:szCs w:val="20"/>
-              </w:rPr>
-              <w:t>(</w:t>
+              <w:t>CalculateTotal(</w:t>
             </w:r>
             <w:proofErr w:type="gramEnd"/>
             <w:r>
@@ -10472,23 +8934,7 @@
                 <w:sz w:val="20"/>
                 <w:szCs w:val="20"/>
               </w:rPr>
-              <w:t xml:space="preserve">) contract. </w:t>
-            </w:r>
-            <w:proofErr w:type="spellStart"/>
-            <w:r>
-              <w:rPr>
-                <w:sz w:val="20"/>
-                <w:szCs w:val="20"/>
-              </w:rPr>
-              <w:t>TimeEntry</w:t>
-            </w:r>
-            <w:proofErr w:type="spellEnd"/>
-            <w:r>
-              <w:rPr>
-                <w:sz w:val="20"/>
-                <w:szCs w:val="20"/>
-              </w:rPr>
-              <w:t xml:space="preserve"> implements it; Invoice calls it to sum entries.</w:t>
+              <w:t>) contract. TimeEntry implements it; Invoice calls it to sum entries.</w:t>
             </w:r>
           </w:p>
         </w:tc>
@@ -10547,23 +8993,7 @@
                 <w:sz w:val="20"/>
                 <w:szCs w:val="20"/>
               </w:rPr>
-              <w:t>Invoice is composed of a Client, a Project, and a List&lt;</w:t>
-            </w:r>
-            <w:proofErr w:type="spellStart"/>
-            <w:r>
-              <w:rPr>
-                <w:sz w:val="20"/>
-                <w:szCs w:val="20"/>
-              </w:rPr>
-              <w:t>TimeEntry</w:t>
-            </w:r>
-            <w:proofErr w:type="spellEnd"/>
-            <w:r>
-              <w:rPr>
-                <w:sz w:val="20"/>
-                <w:szCs w:val="20"/>
-              </w:rPr>
-              <w:t>&gt;. None are owned — they are referenced by value.</w:t>
+              <w:t>Invoice is composed of a Client, a Project, and a List&lt;TimeEntry&gt;. None are owned — they are referenced by value.</w:t>
             </w:r>
           </w:p>
         </w:tc>
@@ -10621,55 +9051,7 @@
                 <w:sz w:val="20"/>
                 <w:szCs w:val="20"/>
               </w:rPr>
-              <w:t xml:space="preserve">Properties use C# backing fields with public getters. </w:t>
-            </w:r>
-            <w:proofErr w:type="spellStart"/>
-            <w:r>
-              <w:rPr>
-                <w:sz w:val="20"/>
-                <w:szCs w:val="20"/>
-              </w:rPr>
-              <w:t>CreatedAt</w:t>
-            </w:r>
-            <w:proofErr w:type="spellEnd"/>
-            <w:r>
-              <w:rPr>
-                <w:sz w:val="20"/>
-                <w:szCs w:val="20"/>
-              </w:rPr>
-              <w:t xml:space="preserve"> uses a protected setter to prevent external modification after construction. Logic is hidden behind methods (e.g., </w:t>
-            </w:r>
-            <w:proofErr w:type="spellStart"/>
-            <w:r>
-              <w:rPr>
-                <w:sz w:val="20"/>
-                <w:szCs w:val="20"/>
-              </w:rPr>
-              <w:t>MarkComplete</w:t>
-            </w:r>
-            <w:proofErr w:type="spellEnd"/>
-            <w:r>
-              <w:rPr>
-                <w:sz w:val="20"/>
-                <w:szCs w:val="20"/>
-              </w:rPr>
-              <w:t xml:space="preserve">, </w:t>
-            </w:r>
-            <w:proofErr w:type="spellStart"/>
-            <w:r>
-              <w:rPr>
-                <w:sz w:val="20"/>
-                <w:szCs w:val="20"/>
-              </w:rPr>
-              <w:t>CalculateTotal</w:t>
-            </w:r>
-            <w:proofErr w:type="spellEnd"/>
-            <w:r>
-              <w:rPr>
-                <w:sz w:val="20"/>
-                <w:szCs w:val="20"/>
-              </w:rPr>
-              <w:t>).</w:t>
+              <w:t>Properties use C# backing fields with public getters. CreatedAt uses a protected setter to prevent external modification after construction. Logic is hidden behind methods (e.g., MarkComplete, CalculateTotal).</w:t>
             </w:r>
           </w:p>
         </w:tc>
@@ -10727,39 +9109,7 @@
                 <w:sz w:val="20"/>
                 <w:szCs w:val="20"/>
               </w:rPr>
-              <w:t xml:space="preserve">Every class defines a constructor that sets required fields and initializes </w:t>
-            </w:r>
-            <w:proofErr w:type="spellStart"/>
-            <w:r>
-              <w:rPr>
-                <w:sz w:val="20"/>
-                <w:szCs w:val="20"/>
-              </w:rPr>
-              <w:t>CreatedAt</w:t>
-            </w:r>
-            <w:proofErr w:type="spellEnd"/>
-            <w:r>
-              <w:rPr>
-                <w:sz w:val="20"/>
-                <w:szCs w:val="20"/>
-              </w:rPr>
-              <w:t xml:space="preserve"> to </w:t>
-            </w:r>
-            <w:proofErr w:type="spellStart"/>
-            <w:r>
-              <w:rPr>
-                <w:sz w:val="20"/>
-                <w:szCs w:val="20"/>
-              </w:rPr>
-              <w:t>DateTime.Now</w:t>
-            </w:r>
-            <w:proofErr w:type="spellEnd"/>
-            <w:r>
-              <w:rPr>
-                <w:sz w:val="20"/>
-                <w:szCs w:val="20"/>
-              </w:rPr>
-              <w:t>. Invoice provides two overloaded constructors.</w:t>
+              <w:t>Every class defines a constructor that sets required fields and initializes CreatedAt to DateTime.Now. Invoice provides two overloaded constructors.</w:t>
             </w:r>
           </w:p>
         </w:tc>
@@ -10767,8 +9117,8 @@
     </w:tbl>
     <w:p/>
     <w:sectPr>
-      <w:headerReference w:type="default" r:id="rId9"/>
-      <w:footerReference w:type="default" r:id="rId10"/>
+      <w:headerReference w:type="default" r:id="rId8"/>
+      <w:footerReference w:type="default" r:id="rId9"/>
       <w:pgSz w:w="12240" w:h="15840"/>
       <w:pgMar w:top="1440" w:right="1440" w:bottom="1440" w:left="1440" w:header="708" w:footer="708" w:gutter="0"/>
       <w:cols w:space="720"/>
@@ -10806,23 +9156,13 @@
       </w:pBdr>
       <w:jc w:val="center"/>
     </w:pPr>
-    <w:proofErr w:type="spellStart"/>
     <w:r>
       <w:rPr>
         <w:color w:val="777777"/>
         <w:sz w:val="18"/>
         <w:szCs w:val="18"/>
       </w:rPr>
-      <w:t>TaskDesk</w:t>
-    </w:r>
-    <w:proofErr w:type="spellEnd"/>
-    <w:r>
-      <w:rPr>
-        <w:color w:val="777777"/>
-        <w:sz w:val="18"/>
-        <w:szCs w:val="18"/>
-      </w:rPr>
-      <w:t xml:space="preserve"> Phase 1 | Sherika Fayson | SDC 320 | June 2026 | Page </w:t>
+      <w:t xml:space="preserve">TaskDesk Phase 1 | Sherika Fayson | SDC 320 | June 2026 | Page </w:t>
     </w:r>
     <w:r>
       <w:fldChar w:fldCharType="begin"/>
@@ -10873,23 +9213,13 @@
         <w:bottom w:val="single" w:sz="6" w:space="1" w:color="2C5F8A"/>
       </w:pBdr>
     </w:pPr>
-    <w:proofErr w:type="spellStart"/>
     <w:r>
       <w:rPr>
         <w:color w:val="555555"/>
         <w:sz w:val="18"/>
         <w:szCs w:val="18"/>
       </w:rPr>
-      <w:t>TaskDesk</w:t>
-    </w:r>
-    <w:proofErr w:type="spellEnd"/>
-    <w:r>
-      <w:rPr>
-        <w:color w:val="555555"/>
-        <w:sz w:val="18"/>
-        <w:szCs w:val="18"/>
-      </w:rPr>
-      <w:t xml:space="preserve"> Client &amp; Invoice </w:t>
+      <w:t xml:space="preserve">TaskDesk Client &amp; Invoice </w:t>
     </w:r>
     <w:r>
       <w:rPr>

</xml_diff>